<commit_message>
ALAGA: wheeled home companion for older adults home alone
The robot now drives on two geared motors along a floor-tape route between
home stations, reminds about medicine, water, and check-ins, checks vital
signs, keeps company with music and prayers, and reports to the family
through Telegram. A new ESP32-C3 pendant detects falls and sends SOS by
ESP-NOW. Paper, PR2 deck, build guide, and programs updated to match.

Co-Authored-By: Claude Opus 5.5 <noreply@anthropic.com>
Claude-Session: https://claude.ai/code/session_01MfReZH7HCVc5jwegZ7NE6b
</commit_message>
<xml_diff>
--- a/research/RIM3_ALAGA/RIM3_ALAGA_Build_Guide.docx
+++ b/research/RIM3_ALAGA/RIM3_ALAGA_Build_Guide.docx
@@ -41,7 +41,7 @@
           <w:b w:val="0"/>
           <w:i/>
         </w:rPr>
-        <w:t>A low-cost soft inflatable healthcare companion robot (RIM-T)</w:t>
+        <w:t>A low-cost wheeled soft companion robot for older adults home alone (RIM-T)</w:t>
       </w:r>
     </w:p>
     <w:p>
@@ -52,7 +52,7 @@
       <w:r>
         <w:drawing>
           <wp:inline xmlns:a="http://schemas.openxmlformats.org/drawingml/2006/main" xmlns:pic="http://schemas.openxmlformats.org/drawingml/2006/picture">
-            <wp:extent cx="3291840" cy="3357097"/>
+            <wp:extent cx="3200400" cy="3620125"/>
             <wp:docPr id="1" name="Picture 1"/>
             <wp:cNvGraphicFramePr>
               <a:graphicFrameLocks noChangeAspect="1"/>
@@ -73,7 +73,7 @@
                   <pic:spPr>
                     <a:xfrm>
                       <a:off x="0" y="0"/>
-                      <a:ext cx="3291840" cy="3357097"/>
+                      <a:ext cx="3200400" cy="3620125"/>
                     </a:xfrm>
                     <a:prstGeom prst="rect"/>
                   </pic:spPr>
@@ -95,7 +95,7 @@
           <w:i/>
           <w:sz w:val="20"/>
         </w:rPr>
-        <w:t>ALAGA when finished: about 1.1 m tall, white, soft, and full of air.</w:t>
+        <w:t>ALAGA when finished: about 1.35 m tall, white, soft, and on wheels.</w:t>
       </w:r>
     </w:p>
     <w:p>
@@ -114,7 +114,7 @@
           <w:b w:val="0"/>
           <w:i w:val="0"/>
         </w:rPr>
-        <w:t xml:space="preserve"> You press its chest or call out “Aray!”. The fan inflates the body, ALAGA greets you, asks for a pain score (0–10), reads your forehead temperature without touching, reads your pulse rate and oxygen level (SpO₂) from your fingertip, then says GREEN, YELLOW, or RED and tells you whether to see the health worker. After 30 seconds with no one there, the fan stops and the body goes flat.</w:t>
+        <w:t xml:space="preserve"> While the family is at work, ALAGA waits flat at its dock. At set times it inflates, drives along a tape line to Lola's or Lolo's chair, and reminds them to take medicine (they press the red button after), drink water, or answer a check-in. Twice a day it checks temperature, pulse rate, oxygen (SpO₂), and pain. It plays music and prayers when called. Every result goes to the family's Telegram group. A pendant worn on a cord detects falls and has an SOS button; a fall or SOS alerts the family within seconds.</w:t>
       </w:r>
     </w:p>
     <w:p>
@@ -133,7 +133,7 @@
           <w:b w:val="0"/>
           <w:i w:val="0"/>
         </w:rPr>
-        <w:t xml:space="preserve"> About 4 weekends: sewing (1), base and electronics (1), programming and voice recording (1), assembly and calibration (1).  </w:t>
+        <w:t xml:space="preserve"> About 5 weekends.  </w:t>
       </w:r>
       <w:r>
         <w:rPr>
@@ -147,7 +147,7 @@
           <w:b w:val="0"/>
           <w:i w:val="0"/>
         </w:rPr>
-        <w:t xml:space="preserve"> about PHP 4,600 (Section 1).</w:t>
+        <w:t xml:space="preserve"> about PHP 6,600 for the robot and pendant (Section 1). Home Wi-Fi is needed for the family messages.</w:t>
       </w:r>
     </w:p>
     <w:tbl>
@@ -178,7 +178,7 @@
                 <w:b w:val="0"/>
                 <w:sz w:val="21"/>
               </w:rPr>
-              <w:t xml:space="preserve"> ALAGA is a school research prototype, not a medical device. It screens and refers; it never diagnoses. Do not test on any person until your school's Institutional Review Board (IRB) approves the research plan and the volunteers sign consent forms (ISEF Form 4).</w:t>
+              <w:t xml:space="preserve"> ALAGA is a school research prototype, not a medical device and not a replacement for a caregiver. It reminds, checks, and alerts; it never diagnoses or gives medicine. Test on people only after the school IRB approves the plan and each participant signs a consent form (ISEF Form 4). Never ask an older adult to simulate a fall.</w:t>
             </w:r>
           </w:p>
         </w:tc>
@@ -214,7 +214,7 @@
           <w:b w:val="0"/>
           <w:i w:val="0"/>
         </w:rPr>
-        <w:t>Prices are estimates from Philippine electronics shops and online stores (Shopee, Lazada, e-Gizmo, Makerlab) in October 2026. Keep every official receipt; the paper's Appendix A uses the same groups.</w:t>
+        <w:t>Prices are estimates from Philippine electronics shops and online stores (Shopee, Lazada, e-Gizmo, Makerlab) in October 2026. Keep every official receipt; the paper's Appendix A uses the same items.</w:t>
       </w:r>
     </w:p>
     <w:tbl>
@@ -304,64 +304,10 @@
             <w:r/>
             <w:r>
               <w:rPr>
-                <w:b/>
-                <w:sz w:val="19"/>
-              </w:rPr>
-              <w:t>A. Body</w:t>
-            </w:r>
-          </w:p>
-        </w:tc>
-        <w:tc>
-          <w:tcPr>
-            <w:tcW w:type="dxa" w:w="1008"/>
-          </w:tcPr>
-          <w:p>
-            <w:pPr>
-              <w:spacing w:after="0" w:line="240" w:lineRule="auto"/>
-            </w:pPr>
-            <w:r/>
-            <w:r>
-              <w:rPr>
-                <w:b/>
-                <w:sz w:val="19"/>
-              </w:rPr>
-            </w:r>
-          </w:p>
-        </w:tc>
-        <w:tc>
-          <w:tcPr>
-            <w:tcW w:type="dxa" w:w="1152"/>
-          </w:tcPr>
-          <w:p>
-            <w:pPr>
-              <w:spacing w:after="0" w:line="240" w:lineRule="auto"/>
-            </w:pPr>
-            <w:r/>
-            <w:r>
-              <w:rPr>
-                <w:b/>
-                <w:sz w:val="19"/>
-              </w:rPr>
-            </w:r>
-          </w:p>
-        </w:tc>
-      </w:tr>
-      <w:tr>
-        <w:tc>
-          <w:tcPr>
-            <w:tcW w:type="dxa" w:w="7632"/>
-          </w:tcPr>
-          <w:p>
-            <w:pPr>
-              <w:spacing w:after="0" w:line="240" w:lineRule="auto"/>
-            </w:pPr>
-            <w:r/>
-            <w:r>
-              <w:rPr>
                 <w:b w:val="0"/>
                 <w:sz w:val="19"/>
               </w:rPr>
-              <w:t>White ripstop nylon, 70D, PU-coated, 150 cm wide</w:t>
+              <w:t>Ripstop nylon 70D, white (per meter) (150 cm wide, PU-coated)</w:t>
             </w:r>
           </w:p>
         </w:tc>
@@ -379,7 +325,7 @@
                 <w:b w:val="0"/>
                 <w:sz w:val="19"/>
               </w:rPr>
-              <w:t>3 m</w:t>
+              <w:t>3</w:t>
             </w:r>
           </w:p>
         </w:tc>
@@ -417,7 +363,7 @@
                 <w:b w:val="0"/>
                 <w:sz w:val="19"/>
               </w:rPr>
-              <w:t>Polyester thread (white), 30-cm zipper, fabric glue or seam sealer, black felt or fabric paint</w:t>
+              <w:t>Seam tape, zipper, thread, felt</w:t>
             </w:r>
           </w:p>
         </w:tc>
@@ -470,64 +416,10 @@
             <w:r/>
             <w:r>
               <w:rPr>
-                <w:b/>
-                <w:sz w:val="19"/>
-              </w:rPr>
-              <w:t>B. Air</w:t>
-            </w:r>
-          </w:p>
-        </w:tc>
-        <w:tc>
-          <w:tcPr>
-            <w:tcW w:type="dxa" w:w="1008"/>
-          </w:tcPr>
-          <w:p>
-            <w:pPr>
-              <w:spacing w:after="0" w:line="240" w:lineRule="auto"/>
-            </w:pPr>
-            <w:r/>
-            <w:r>
-              <w:rPr>
-                <w:b/>
-                <w:sz w:val="19"/>
-              </w:rPr>
-            </w:r>
-          </w:p>
-        </w:tc>
-        <w:tc>
-          <w:tcPr>
-            <w:tcW w:type="dxa" w:w="1152"/>
-          </w:tcPr>
-          <w:p>
-            <w:pPr>
-              <w:spacing w:after="0" w:line="240" w:lineRule="auto"/>
-            </w:pPr>
-            <w:r/>
-            <w:r>
-              <w:rPr>
-                <w:b/>
-                <w:sz w:val="19"/>
-              </w:rPr>
-            </w:r>
-          </w:p>
-        </w:tc>
-      </w:tr>
-      <w:tr>
-        <w:tc>
-          <w:tcPr>
-            <w:tcW w:type="dxa" w:w="7632"/>
-          </w:tcPr>
-          <w:p>
-            <w:pPr>
-              <w:spacing w:after="0" w:line="240" w:lineRule="auto"/>
-            </w:pPr>
-            <w:r/>
-            <w:r>
-              <w:rPr>
                 <w:b w:val="0"/>
                 <w:sz w:val="19"/>
               </w:rPr>
-              <w:t>12 V DC radial blower fan (e.g., 9733 size, 0.3–0.8 A) with a metal finger guard</w:t>
+              <w:t>12 V DC blower fan with guard</w:t>
             </w:r>
           </w:p>
         </w:tc>
@@ -580,10 +472,10 @@
             <w:r/>
             <w:r>
               <w:rPr>
-                <w:b/>
+                <w:b w:val="0"/>
                 <w:sz w:val="19"/>
               </w:rPr>
-              <w:t>C. Controller and sensors</w:t>
+              <w:t>12 V JGA25-370 geared motor with bracket (12 V, about 130 rpm, with mounting bracket)</w:t>
             </w:r>
           </w:p>
         </w:tc>
@@ -598,9 +490,10 @@
             <w:r/>
             <w:r>
               <w:rPr>
-                <w:b/>
+                <w:b w:val="0"/>
                 <w:sz w:val="19"/>
               </w:rPr>
+              <w:t>2</w:t>
             </w:r>
           </w:p>
         </w:tc>
@@ -615,9 +508,10 @@
             <w:r/>
             <w:r>
               <w:rPr>
-                <w:b/>
+                <w:b w:val="0"/>
                 <w:sz w:val="19"/>
               </w:rPr>
+              <w:t>700</w:t>
             </w:r>
           </w:p>
         </w:tc>
@@ -637,7 +531,175 @@
                 <w:b w:val="0"/>
                 <w:sz w:val="19"/>
               </w:rPr>
-              <w:t>ESP32 DevKit V1 (30-pin) with USB cable</w:t>
+              <w:t>65-mm wheels with couplers (pair); 2-in caster (4-mm or 6-mm couplers to match the motor shaft)</w:t>
+            </w:r>
+          </w:p>
+        </w:tc>
+        <w:tc>
+          <w:tcPr>
+            <w:tcW w:type="dxa" w:w="1008"/>
+          </w:tcPr>
+          <w:p>
+            <w:pPr>
+              <w:spacing w:after="0" w:line="240" w:lineRule="auto"/>
+            </w:pPr>
+            <w:r/>
+            <w:r>
+              <w:rPr>
+                <w:b w:val="0"/>
+                <w:sz w:val="19"/>
+              </w:rPr>
+              <w:t>1 set</w:t>
+            </w:r>
+          </w:p>
+        </w:tc>
+        <w:tc>
+          <w:tcPr>
+            <w:tcW w:type="dxa" w:w="1152"/>
+          </w:tcPr>
+          <w:p>
+            <w:pPr>
+              <w:spacing w:after="0" w:line="240" w:lineRule="auto"/>
+            </w:pPr>
+            <w:r/>
+            <w:r>
+              <w:rPr>
+                <w:b w:val="0"/>
+                <w:sz w:val="19"/>
+              </w:rPr>
+              <w:t>210</w:t>
+            </w:r>
+          </w:p>
+        </w:tc>
+      </w:tr>
+      <w:tr>
+        <w:tc>
+          <w:tcPr>
+            <w:tcW w:type="dxa" w:w="7632"/>
+          </w:tcPr>
+          <w:p>
+            <w:pPr>
+              <w:spacing w:after="0" w:line="240" w:lineRule="auto"/>
+            </w:pPr>
+            <w:r/>
+            <w:r>
+              <w:rPr>
+                <w:b w:val="0"/>
+                <w:sz w:val="19"/>
+              </w:rPr>
+              <w:t>L298N motor driver</w:t>
+            </w:r>
+          </w:p>
+        </w:tc>
+        <w:tc>
+          <w:tcPr>
+            <w:tcW w:type="dxa" w:w="1008"/>
+          </w:tcPr>
+          <w:p>
+            <w:pPr>
+              <w:spacing w:after="0" w:line="240" w:lineRule="auto"/>
+            </w:pPr>
+            <w:r/>
+            <w:r>
+              <w:rPr>
+                <w:b w:val="0"/>
+                <w:sz w:val="19"/>
+              </w:rPr>
+              <w:t>1</w:t>
+            </w:r>
+          </w:p>
+        </w:tc>
+        <w:tc>
+          <w:tcPr>
+            <w:tcW w:type="dxa" w:w="1152"/>
+          </w:tcPr>
+          <w:p>
+            <w:pPr>
+              <w:spacing w:after="0" w:line="240" w:lineRule="auto"/>
+            </w:pPr>
+            <w:r/>
+            <w:r>
+              <w:rPr>
+                <w:b w:val="0"/>
+                <w:sz w:val="19"/>
+              </w:rPr>
+              <w:t>120</w:t>
+            </w:r>
+          </w:p>
+        </w:tc>
+      </w:tr>
+      <w:tr>
+        <w:tc>
+          <w:tcPr>
+            <w:tcW w:type="dxa" w:w="7632"/>
+          </w:tcPr>
+          <w:p>
+            <w:pPr>
+              <w:spacing w:after="0" w:line="240" w:lineRule="auto"/>
+            </w:pPr>
+            <w:r/>
+            <w:r>
+              <w:rPr>
+                <w:b w:val="0"/>
+                <w:sz w:val="19"/>
+              </w:rPr>
+              <w:t>5-channel line sensor; 2 bumper microswitches (TCRT5000 5-way tracking module; lever microswitches)</w:t>
+            </w:r>
+          </w:p>
+        </w:tc>
+        <w:tc>
+          <w:tcPr>
+            <w:tcW w:type="dxa" w:w="1008"/>
+          </w:tcPr>
+          <w:p>
+            <w:pPr>
+              <w:spacing w:after="0" w:line="240" w:lineRule="auto"/>
+            </w:pPr>
+            <w:r/>
+            <w:r>
+              <w:rPr>
+                <w:b w:val="0"/>
+                <w:sz w:val="19"/>
+              </w:rPr>
+              <w:t>1 set</w:t>
+            </w:r>
+          </w:p>
+        </w:tc>
+        <w:tc>
+          <w:tcPr>
+            <w:tcW w:type="dxa" w:w="1152"/>
+          </w:tcPr>
+          <w:p>
+            <w:pPr>
+              <w:spacing w:after="0" w:line="240" w:lineRule="auto"/>
+            </w:pPr>
+            <w:r/>
+            <w:r>
+              <w:rPr>
+                <w:b w:val="0"/>
+                <w:sz w:val="19"/>
+              </w:rPr>
+              <w:t>220</w:t>
+            </w:r>
+          </w:p>
+        </w:tc>
+      </w:tr>
+      <w:tr>
+        <w:tc>
+          <w:tcPr>
+            <w:tcW w:type="dxa" w:w="7632"/>
+          </w:tcPr>
+          <w:p>
+            <w:pPr>
+              <w:spacing w:after="0" w:line="240" w:lineRule="auto"/>
+            </w:pPr>
+            <w:r/>
+            <w:r>
+              <w:rPr>
+                <w:b w:val="0"/>
+                <w:sz w:val="19"/>
+              </w:rPr>
+              <w:t>ESP32 development board</w:t>
             </w:r>
           </w:p>
         </w:tc>
@@ -693,7 +755,7 @@
                 <w:b w:val="0"/>
                 <w:sz w:val="19"/>
               </w:rPr>
-              <w:t>MLX90614 non-contact IR thermometer module (GY-906, 3.3–5 V)</w:t>
+              <w:t>MLX90614 (GY-906) module</w:t>
             </w:r>
           </w:p>
         </w:tc>
@@ -749,7 +811,7 @@
                 <w:b w:val="0"/>
                 <w:sz w:val="19"/>
               </w:rPr>
-              <w:t>MAX30102 pulse oximeter module (3.3 V I²C pull-ups)</w:t>
+              <w:t>MAX30102 module</w:t>
             </w:r>
           </w:p>
         </w:tc>
@@ -805,7 +867,7 @@
                 <w:b w:val="0"/>
                 <w:sz w:val="19"/>
               </w:rPr>
-              <w:t>HC-SR04 ultrasonic distance sensor</w:t>
+              <w:t>HC-SR04 ultrasonic sensor</w:t>
             </w:r>
           </w:p>
         </w:tc>
@@ -861,7 +923,7 @@
                 <w:b w:val="0"/>
                 <w:sz w:val="19"/>
               </w:rPr>
-              <w:t>0.96-in OLED display, 128 × 64, I²C (SSD1306, 4-pin)</w:t>
+              <w:t>0.96-in OLED display</w:t>
             </w:r>
           </w:p>
         </w:tc>
@@ -914,64 +976,10 @@
             <w:r/>
             <w:r>
               <w:rPr>
-                <w:b/>
-                <w:sz w:val="19"/>
-              </w:rPr>
-              <w:t>D. Voice</w:t>
-            </w:r>
-          </w:p>
-        </w:tc>
-        <w:tc>
-          <w:tcPr>
-            <w:tcW w:type="dxa" w:w="1008"/>
-          </w:tcPr>
-          <w:p>
-            <w:pPr>
-              <w:spacing w:after="0" w:line="240" w:lineRule="auto"/>
-            </w:pPr>
-            <w:r/>
-            <w:r>
-              <w:rPr>
-                <w:b/>
-                <w:sz w:val="19"/>
-              </w:rPr>
-            </w:r>
-          </w:p>
-        </w:tc>
-        <w:tc>
-          <w:tcPr>
-            <w:tcW w:type="dxa" w:w="1152"/>
-          </w:tcPr>
-          <w:p>
-            <w:pPr>
-              <w:spacing w:after="0" w:line="240" w:lineRule="auto"/>
-            </w:pPr>
-            <w:r/>
-            <w:r>
-              <w:rPr>
-                <w:b/>
-                <w:sz w:val="19"/>
-              </w:rPr>
-            </w:r>
-          </w:p>
-        </w:tc>
-      </w:tr>
-      <w:tr>
-        <w:tc>
-          <w:tcPr>
-            <w:tcW w:type="dxa" w:w="7632"/>
-          </w:tcPr>
-          <w:p>
-            <w:pPr>
-              <w:spacing w:after="0" w:line="240" w:lineRule="auto"/>
-            </w:pPr>
-            <w:r/>
-            <w:r>
-              <w:rPr>
                 <w:b w:val="0"/>
                 <w:sz w:val="19"/>
               </w:rPr>
-              <w:t>DFPlayer Mini MP3 module and 8 GB microSD card</w:t>
+              <w:t>DFPlayer Mini, 8 GB microSD, 3 W speaker</w:t>
             </w:r>
           </w:p>
         </w:tc>
@@ -1007,7 +1015,7 @@
                 <w:b w:val="0"/>
                 <w:sz w:val="19"/>
               </w:rPr>
-              <w:t>300</w:t>
+              <w:t>380</w:t>
             </w:r>
           </w:p>
         </w:tc>
@@ -1027,7 +1035,7 @@
                 <w:b w:val="0"/>
                 <w:sz w:val="19"/>
               </w:rPr>
-              <w:t>Speaker, 3 W, 4 Ω (about 5 cm)</w:t>
+              <w:t>KY-037 sound sensor, button, 10 kΩ dial</w:t>
             </w:r>
           </w:p>
         </w:tc>
@@ -1045,117 +1053,7 @@
                 <w:b w:val="0"/>
                 <w:sz w:val="19"/>
               </w:rPr>
-              <w:t>1</w:t>
-            </w:r>
-          </w:p>
-        </w:tc>
-        <w:tc>
-          <w:tcPr>
-            <w:tcW w:type="dxa" w:w="1152"/>
-          </w:tcPr>
-          <w:p>
-            <w:pPr>
-              <w:spacing w:after="0" w:line="240" w:lineRule="auto"/>
-            </w:pPr>
-            <w:r/>
-            <w:r>
-              <w:rPr>
-                <w:b w:val="0"/>
-                <w:sz w:val="19"/>
-              </w:rPr>
-              <w:t>80</w:t>
-            </w:r>
-          </w:p>
-        </w:tc>
-      </w:tr>
-      <w:tr>
-        <w:tc>
-          <w:tcPr>
-            <w:tcW w:type="dxa" w:w="7632"/>
-          </w:tcPr>
-          <w:p>
-            <w:pPr>
-              <w:spacing w:after="0" w:line="240" w:lineRule="auto"/>
-            </w:pPr>
-            <w:r/>
-            <w:r>
-              <w:rPr>
-                <w:b/>
-                <w:sz w:val="19"/>
-              </w:rPr>
-              <w:t>E. Controls</w:t>
-            </w:r>
-          </w:p>
-        </w:tc>
-        <w:tc>
-          <w:tcPr>
-            <w:tcW w:type="dxa" w:w="1008"/>
-          </w:tcPr>
-          <w:p>
-            <w:pPr>
-              <w:spacing w:after="0" w:line="240" w:lineRule="auto"/>
-            </w:pPr>
-            <w:r/>
-            <w:r>
-              <w:rPr>
-                <w:b/>
-                <w:sz w:val="19"/>
-              </w:rPr>
-            </w:r>
-          </w:p>
-        </w:tc>
-        <w:tc>
-          <w:tcPr>
-            <w:tcW w:type="dxa" w:w="1152"/>
-          </w:tcPr>
-          <w:p>
-            <w:pPr>
-              <w:spacing w:after="0" w:line="240" w:lineRule="auto"/>
-            </w:pPr>
-            <w:r/>
-            <w:r>
-              <w:rPr>
-                <w:b/>
-                <w:sz w:val="19"/>
-              </w:rPr>
-            </w:r>
-          </w:p>
-        </w:tc>
-      </w:tr>
-      <w:tr>
-        <w:tc>
-          <w:tcPr>
-            <w:tcW w:type="dxa" w:w="7632"/>
-          </w:tcPr>
-          <w:p>
-            <w:pPr>
-              <w:spacing w:after="0" w:line="240" w:lineRule="auto"/>
-            </w:pPr>
-            <w:r/>
-            <w:r>
-              <w:rPr>
-                <w:b w:val="0"/>
-                <w:sz w:val="19"/>
-              </w:rPr>
-              <w:t>KY-037 sound sensor, 60-mm arcade push button (red), 10 kΩ potentiometer with knob</w:t>
-            </w:r>
-          </w:p>
-        </w:tc>
-        <w:tc>
-          <w:tcPr>
-            <w:tcW w:type="dxa" w:w="1008"/>
-          </w:tcPr>
-          <w:p>
-            <w:pPr>
-              <w:spacing w:after="0" w:line="240" w:lineRule="auto"/>
-            </w:pPr>
-            <w:r/>
-            <w:r>
-              <w:rPr>
-                <w:b w:val="0"/>
-                <w:sz w:val="19"/>
-              </w:rPr>
-              <w:t>1 each</w:t>
+              <w:t>1 set</w:t>
             </w:r>
           </w:p>
         </w:tc>
@@ -1190,64 +1088,10 @@
             <w:r/>
             <w:r>
               <w:rPr>
-                <w:b/>
-                <w:sz w:val="19"/>
-              </w:rPr>
-              <w:t>F. Power</w:t>
-            </w:r>
-          </w:p>
-        </w:tc>
-        <w:tc>
-          <w:tcPr>
-            <w:tcW w:type="dxa" w:w="1008"/>
-          </w:tcPr>
-          <w:p>
-            <w:pPr>
-              <w:spacing w:after="0" w:line="240" w:lineRule="auto"/>
-            </w:pPr>
-            <w:r/>
-            <w:r>
-              <w:rPr>
-                <w:b/>
-                <w:sz w:val="19"/>
-              </w:rPr>
-            </w:r>
-          </w:p>
-        </w:tc>
-        <w:tc>
-          <w:tcPr>
-            <w:tcW w:type="dxa" w:w="1152"/>
-          </w:tcPr>
-          <w:p>
-            <w:pPr>
-              <w:spacing w:after="0" w:line="240" w:lineRule="auto"/>
-            </w:pPr>
-            <w:r/>
-            <w:r>
-              <w:rPr>
-                <w:b/>
-                <w:sz w:val="19"/>
-              </w:rPr>
-            </w:r>
-          </w:p>
-        </w:tc>
-      </w:tr>
-      <w:tr>
-        <w:tc>
-          <w:tcPr>
-            <w:tcW w:type="dxa" w:w="7632"/>
-          </w:tcPr>
-          <w:p>
-            <w:pPr>
-              <w:spacing w:after="0" w:line="240" w:lineRule="auto"/>
-            </w:pPr>
-            <w:r/>
-            <w:r>
-              <w:rPr>
                 <w:b w:val="0"/>
                 <w:sz w:val="19"/>
               </w:rPr>
-              <w:t>12 V 7 Ah sealed lead-acid (SLA) battery</w:t>
+              <w:t>12 V 7 Ah SLA battery</w:t>
             </w:r>
           </w:p>
         </w:tc>
@@ -1303,7 +1147,7 @@
                 <w:b w:val="0"/>
                 <w:sz w:val="19"/>
               </w:rPr>
-              <w:t>LM2596 buck converter, D4184 MOSFET module, fuse holder with 3 A fuse, rocker switch, 1N5819 diode</w:t>
+              <w:t>LM2596, D4184 module, fuse, switch, diode</w:t>
             </w:r>
           </w:p>
         </w:tc>
@@ -1356,10 +1200,10 @@
             <w:r/>
             <w:r>
               <w:rPr>
-                <w:b/>
+                <w:b w:val="0"/>
                 <w:sz w:val="19"/>
               </w:rPr>
-              <w:t>G. Frame, box, and wiring</w:t>
+              <w:t>Pendant: ESP32-C3, MPU6050, LiPo, TP4056, buzzer, case (ESP32-C3 SuperMini, GY-521, 400 mAh 3.7 V LiPo, active 3 V buzzer, 12-mm button, small box, cord)</w:t>
             </w:r>
           </w:p>
         </w:tc>
@@ -1374,9 +1218,10 @@
             <w:r/>
             <w:r>
               <w:rPr>
-                <w:b/>
+                <w:b w:val="0"/>
                 <w:sz w:val="19"/>
               </w:rPr>
+              <w:t>1 set</w:t>
             </w:r>
           </w:p>
         </w:tc>
@@ -1391,9 +1236,10 @@
             <w:r/>
             <w:r>
               <w:rPr>
-                <w:b/>
+                <w:b w:val="0"/>
                 <w:sz w:val="19"/>
               </w:rPr>
+              <w:t>600</w:t>
             </w:r>
           </w:p>
         </w:tc>
@@ -1413,7 +1259,7 @@
                 <w:b w:val="0"/>
                 <w:sz w:val="19"/>
               </w:rPr>
-              <w:t>Jumper wires, 3-core cable (1 m), perfboard 7 × 9 cm, resistors 1 kΩ (×2) and 2 kΩ (×1), heat-shrink</w:t>
+              <w:t>Wires, perfboard, chest box, plywood, PVC, screws (20 × 15 × 7 cm project box; 9-mm plywood; 3/4-in PVC, T, end cap, floor flange; 10-core ribbon cable; 1 kΩ ×2, 2 kΩ ×1; grommet kit)</w:t>
             </w:r>
           </w:p>
         </w:tc>
@@ -1449,7 +1295,7 @@
                 <w:b w:val="0"/>
                 <w:sz w:val="19"/>
               </w:rPr>
-              <w:t>160</w:t>
+              <w:t>550</w:t>
             </w:r>
           </w:p>
         </w:tc>
@@ -1469,7 +1315,7 @@
                 <w:b w:val="0"/>
                 <w:sz w:val="19"/>
               </w:rPr>
-              <w:t>Plastic project box about 20 × 15 × 7 cm (chest box)</w:t>
+              <w:t>Black electrical tape, 19 mm</w:t>
             </w:r>
           </w:p>
         </w:tc>
@@ -1487,7 +1333,7 @@
                 <w:b w:val="0"/>
                 <w:sz w:val="19"/>
               </w:rPr>
-              <w:t>1</w:t>
+              <w:t>3 rolls</w:t>
             </w:r>
           </w:p>
         </w:tc>
@@ -1505,7 +1351,7 @@
                 <w:b w:val="0"/>
                 <w:sz w:val="19"/>
               </w:rPr>
-              <w:t>150</w:t>
+              <w:t>120</w:t>
             </w:r>
           </w:p>
         </w:tc>
@@ -1525,117 +1371,7 @@
                 <w:b w:val="0"/>
                 <w:sz w:val="19"/>
               </w:rPr>
-              <w:t>12-mm plywood for a 40 × 40 × 15 cm base box; 3/4-in PVC pipe 1 m, T, end cap, floor flange; screws, Velcro, zip ties, 25-mm grommet kit</w:t>
-            </w:r>
-          </w:p>
-        </w:tc>
-        <w:tc>
-          <w:tcPr>
-            <w:tcW w:type="dxa" w:w="1008"/>
-          </w:tcPr>
-          <w:p>
-            <w:pPr>
-              <w:spacing w:after="0" w:line="240" w:lineRule="auto"/>
-            </w:pPr>
-            <w:r/>
-            <w:r>
-              <w:rPr>
-                <w:b w:val="0"/>
-                <w:sz w:val="19"/>
-              </w:rPr>
-              <w:t>1 lot</w:t>
-            </w:r>
-          </w:p>
-        </w:tc>
-        <w:tc>
-          <w:tcPr>
-            <w:tcW w:type="dxa" w:w="1152"/>
-          </w:tcPr>
-          <w:p>
-            <w:pPr>
-              <w:spacing w:after="0" w:line="240" w:lineRule="auto"/>
-            </w:pPr>
-            <w:r/>
-            <w:r>
-              <w:rPr>
-                <w:b w:val="0"/>
-                <w:sz w:val="19"/>
-              </w:rPr>
-              <w:t>240</w:t>
-            </w:r>
-          </w:p>
-        </w:tc>
-      </w:tr>
-      <w:tr>
-        <w:tc>
-          <w:tcPr>
-            <w:tcW w:type="dxa" w:w="7632"/>
-          </w:tcPr>
-          <w:p>
-            <w:pPr>
-              <w:spacing w:after="0" w:line="240" w:lineRule="auto"/>
-            </w:pPr>
-            <w:r/>
-            <w:r>
-              <w:rPr>
-                <w:b/>
-                <w:sz w:val="19"/>
-              </w:rPr>
-              <w:t>H. For the study only</w:t>
-            </w:r>
-          </w:p>
-        </w:tc>
-        <w:tc>
-          <w:tcPr>
-            <w:tcW w:type="dxa" w:w="1008"/>
-          </w:tcPr>
-          <w:p>
-            <w:pPr>
-              <w:spacing w:after="0" w:line="240" w:lineRule="auto"/>
-            </w:pPr>
-            <w:r/>
-            <w:r>
-              <w:rPr>
-                <w:b/>
-                <w:sz w:val="19"/>
-              </w:rPr>
-            </w:r>
-          </w:p>
-        </w:tc>
-        <w:tc>
-          <w:tcPr>
-            <w:tcW w:type="dxa" w:w="1152"/>
-          </w:tcPr>
-          <w:p>
-            <w:pPr>
-              <w:spacing w:after="0" w:line="240" w:lineRule="auto"/>
-            </w:pPr>
-            <w:r/>
-            <w:r>
-              <w:rPr>
-                <w:b/>
-                <w:sz w:val="19"/>
-              </w:rPr>
-            </w:r>
-          </w:p>
-        </w:tc>
-      </w:tr>
-      <w:tr>
-        <w:tc>
-          <w:tcPr>
-            <w:tcW w:type="dxa" w:w="7632"/>
-          </w:tcPr>
-          <w:p>
-            <w:pPr>
-              <w:spacing w:after="0" w:line="240" w:lineRule="auto"/>
-            </w:pPr>
-            <w:r/>
-            <w:r>
-              <w:rPr>
-                <w:b w:val="0"/>
-                <w:sz w:val="19"/>
-              </w:rPr>
-              <w:t>Corrugated plastic (coroplast) sheet for the rigid shell (usability test)</w:t>
+              <w:t>Rigid shell for the usability test</w:t>
             </w:r>
           </w:p>
         </w:tc>
@@ -1691,7 +1427,7 @@
                 <w:b w:val="0"/>
                 <w:sz w:val="19"/>
               </w:rPr>
-              <w:t>70% alcohol, wipes, printed data sheets</w:t>
+              <w:t>70% alcohol, wipes, data sheets</w:t>
             </w:r>
           </w:p>
         </w:tc>
@@ -1782,7 +1518,7 @@
                 <w:b/>
                 <w:sz w:val="19"/>
               </w:rPr>
-              <w:t>4,630</w:t>
+              <w:t>6,600</w:t>
             </w:r>
           </w:p>
         </w:tc>
@@ -1823,7 +1559,7 @@
         </w:rPr>
         <w:t>•</w:t>
         <w:tab/>
-        <w:t>Sewing machine (a hand needle works but is slow), fabric scissors, measuring tape, tailor's chalk, pins</w:t>
+        <w:t>Sewing machine, fabric scissors, measuring tape, tailor's chalk, pins</w:t>
       </w:r>
     </w:p>
     <w:p>
@@ -1841,7 +1577,7 @@
         </w:rPr>
         <w:t>•</w:t>
         <w:tab/>
-        <w:t>Soldering iron and solder, wire stripper, small screwdriver, multimeter, hot-glue gun</w:t>
+        <w:t>Soldering iron and solder, wire stripper, screwdriver set, multimeter, hot-glue gun</w:t>
       </w:r>
     </w:p>
     <w:p>
@@ -1859,7 +1595,7 @@
         </w:rPr>
         <w:t>•</w:t>
         <w:tab/>
-        <w:t>Drill with bits, 2.5-cm hole saw or spade bit, jigsaw or hand saw for plywood, PVC cutter</w:t>
+        <w:t>Drill with bits, jigsaw or hand saw, PVC cutter</w:t>
       </w:r>
     </w:p>
     <w:p>
@@ -1877,7 +1613,7 @@
         </w:rPr>
         <w:t>•</w:t>
         <w:tab/>
-        <w:t>Laptop with the Arduino IDE 2, and a phone for recording the voice prompts</w:t>
+        <w:t>Laptop with Arduino IDE 2; a phone with Telegram; a phone for recording the voice</w:t>
       </w:r>
     </w:p>
     <w:p>
@@ -1895,7 +1631,7 @@
         </w:rPr>
         <w:t>•</w:t>
         <w:tab/>
-        <w:t>12 V SLA battery charger (1–2 A)</w:t>
+        <w:t>12 V SLA battery charger (1–2 A) and a USB charger for the pendant</w:t>
       </w:r>
     </w:p>
     <w:p>
@@ -1913,25 +1649,7 @@
         </w:rPr>
         <w:t>•</w:t>
         <w:tab/>
-        <w:t>For calibration and testing: clinical forehead thermometer and fingertip pulse oximeter (borrow from the school clinic), a digital probe thermometer, a pot, a black-painted aluminum can, and hot water</w:t>
-      </w:r>
-    </w:p>
-    <w:p>
-      <w:pPr>
-        <w:tabs>
-          <w:tab w:pos="432" w:val="left"/>
-        </w:tabs>
-        <w:spacing w:after="80"/>
-        <w:ind w:left="432" w:hanging="288"/>
-      </w:pPr>
-      <w:r>
-        <w:rPr>
-          <w:b w:val="0"/>
-          <w:i w:val="0"/>
-        </w:rPr>
-        <w:t>•</w:t>
-        <w:tab/>
-        <w:t>A sturdy plastic stool or table about 45 cm high to put ALAGA on</w:t>
+        <w:t>For calibration and tests: clinic forehead thermometer and fingertip pulse oximeter, probe thermometer, pot and black-painted can, two 20-cm gym mats, knee and elbow pads, stopwatch, tape measure</w:t>
       </w:r>
     </w:p>
     <w:p>
@@ -1964,7 +1682,7 @@
         </w:rPr>
         <w:t>•</w:t>
         <w:tab/>
-        <w:t>Solder only with an adult present, in a ventilated room; unplug the iron when you leave.</w:t>
+        <w:t>Solder only with an adult present, in a ventilated room.</w:t>
       </w:r>
     </w:p>
     <w:p>
@@ -1982,7 +1700,7 @@
         </w:rPr>
         <w:t>•</w:t>
         <w:tab/>
-        <w:t>Set the LM2596 output to 5.0 V with a multimeter BEFORE connecting the ESP32; 12 V will destroy it.</w:t>
+        <w:t>Set the LM2596 output to 5.0 V with a multimeter BEFORE connecting anything to it.</w:t>
       </w:r>
     </w:p>
     <w:p>
@@ -2000,7 +1718,7 @@
         </w:rPr>
         <w:t>•</w:t>
         <w:tab/>
-        <w:t>Always put the 3 A fuse on the battery's + wire. Never short the battery terminals.</w:t>
+        <w:t>Put the 3 A fuse on the battery + wire. Never short the battery or the LiPo.</w:t>
       </w:r>
     </w:p>
     <w:p>
@@ -2018,7 +1736,7 @@
         </w:rPr>
         <w:t>•</w:t>
         <w:tab/>
-        <w:t>Keep fingers away from the fan; the guard goes on the intake side.</w:t>
+        <w:t>Lift the wheels off the floor the first time you test the motors.</w:t>
       </w:r>
     </w:p>
     <w:p>
@@ -2036,7 +1754,7 @@
         </w:rPr>
         <w:t>•</w:t>
         <w:tab/>
-        <w:t>Charge the battery only under supervision, on a non-flammable surface.</w:t>
+        <w:t>Keep fingers away from the fan and the wheels.</w:t>
       </w:r>
     </w:p>
     <w:p>
@@ -2064,7 +1782,7 @@
           <w:b w:val="0"/>
           <w:i w:val="0"/>
         </w:rPr>
-        <w:t>The body is a “constant-air” inflatable, like an inflatable costume: the fan runs the whole time and air slowly leaks out of the seams. Seams do not need to be airtight, but they must be strong.</w:t>
+        <w:t>The body is a constant-air inflatable, like an inflatable costume: the fan runs while ALAGA is working and air slowly leaks out. Seams do not need to be airtight, but they must be strong.</w:t>
       </w:r>
     </w:p>
     <w:p>
@@ -2075,7 +1793,7 @@
       <w:r>
         <w:drawing>
           <wp:inline xmlns:a="http://schemas.openxmlformats.org/drawingml/2006/main" xmlns:pic="http://schemas.openxmlformats.org/drawingml/2006/picture">
-            <wp:extent cx="6035040" cy="3734893"/>
+            <wp:extent cx="5852160" cy="4171394"/>
             <wp:docPr id="2" name="Picture 2"/>
             <wp:cNvGraphicFramePr>
               <a:graphicFrameLocks noChangeAspect="1"/>
@@ -2096,7 +1814,7 @@
                   <pic:spPr>
                     <a:xfrm>
                       <a:off x="0" y="0"/>
-                      <a:ext cx="6035040" cy="3734893"/>
+                      <a:ext cx="5852160" cy="4171394"/>
                     </a:xfrm>
                     <a:prstGeom prst="rect"/>
                   </pic:spPr>
@@ -2118,7 +1836,7 @@
           <w:i/>
           <w:sz w:val="20"/>
         </w:rPr>
-        <w:t>Figure A. Cutting pattern. Draw the ovals by measuring width and height and connecting the points with a smooth curve (use a string as a compass).</w:t>
+        <w:t>Figure A. Cutting pattern (cm). Draw each oval by marking its width and height and joining the points with a smooth curve.</w:t>
       </w:r>
     </w:p>
     <w:p>
@@ -2136,7 +1854,7 @@
         </w:rPr>
         <w:t>1.</w:t>
         <w:tab/>
-        <w:t>Lay the fabric flat and mark the pieces in Figure A with chalk: two body panels (64 × 79 cm ovals with a 30-cm flat opening at the bottom), two body gusset strips (110 × 27 cm), two head panels (34 × 26 cm ovals), one head gusset (92 × 14 cm), one neck tube (40 × 14 cm), and two 5-cm black felt eyes.</w:t>
+        <w:t>Mark and cut: two body panels (64 × 99 cm ovals with a 30-cm flat opening at the bottom), two body gusset strips (120 × 27 cm), two head panels (34 × 26 cm ovals), one head gusset (92 × 14 cm), one neck tube (40 × 14 cm), and two 5-cm black felt eyes.</w:t>
       </w:r>
     </w:p>
     <w:p>
@@ -2154,7 +1872,7 @@
         </w:rPr>
         <w:t>2.</w:t>
         <w:tab/>
-        <w:t>Cut all pieces. Sew the two body gusset strips end to end into one long strip (about 218 cm).</w:t>
+        <w:t>Sew the two gusset strips end to end into one strip about 238 cm long.</w:t>
       </w:r>
     </w:p>
     <w:p>
@@ -2172,7 +1890,7 @@
         </w:rPr>
         <w:t>3.</w:t>
         <w:tab/>
-        <w:t>Front panel: mark a point on the center line 40 cm above the bottom opening. Iron-on or glue a 10 × 10 cm patch of extra fabric on the inside there, then punch the 25-mm grommet through both layers. The chest box will be bolted through this hole.</w:t>
+        <w:t>Front panel: 65 cm above the bottom opening, glue a 10 × 10 cm patch inside and fix the 25-mm grommet through both layers. The chest box is bolted to the spine through this hole.</w:t>
       </w:r>
     </w:p>
     <w:p>
@@ -2190,7 +1908,7 @@
         </w:rPr>
         <w:t>4.</w:t>
         <w:tab/>
-        <w:t>Pin the gusset strip around the edge of the front panel, right sides together, from one side of the bottom opening, up and over the top, down to the other side. Sew 1 cm from the edge. Trim any extra strip.</w:t>
+        <w:t>Sew the gusset around the front panel from one side of the bottom opening, over the top, to the other side. Sew the back panel to the other edge of the gusset. Trim extra strip. Turn right side out.</w:t>
       </w:r>
     </w:p>
     <w:p>
@@ -2208,7 +1926,7 @@
         </w:rPr>
         <w:t>5.</w:t>
         <w:tab/>
-        <w:t>Sew the back panel to the other edge of the gusset the same way. Turn the body right side out. You now have a thick, pillow-like body with a 30-cm opening at the bottom.</w:t>
+        <w:t>Cut a 12-cm neck hole at the top of the gusset. Sew the head (two panels and the head gusset) with a 12-cm hole underneath, and join the two holes with the neck tube so air reaches the head.</w:t>
       </w:r>
     </w:p>
     <w:p>
@@ -2226,7 +1944,7 @@
         </w:rPr>
         <w:t>6.</w:t>
         <w:tab/>
-        <w:t>Cut a 12-cm circle in the center of the gusset at the very top (the neck hole).</w:t>
+        <w:t>Glue or sew the two black felt eyes about 6 cm apart.</w:t>
       </w:r>
     </w:p>
     <w:p>
@@ -2244,7 +1962,149 @@
         </w:rPr>
         <w:t>7.</w:t>
         <w:tab/>
-        <w:t>Head: sew the head gusset around one head panel, then the other head panel, leaving a 12-cm hole in the middle of the bottom of the gusset. Turn right side out.</w:t>
+        <w:t>Hem the bottom opening (fold 2 cm). It will be stapled to the top of the base.</w:t>
+      </w:r>
+    </w:p>
+    <w:p>
+      <w:pPr>
+        <w:keepNext/>
+        <w:pageBreakBefore/>
+        <w:spacing w:after="120"/>
+      </w:pPr>
+      <w:r>
+        <w:rPr>
+          <w:b/>
+          <w:i w:val="0"/>
+          <w:color w:val="1F2A44"/>
+          <w:sz w:val="30"/>
+        </w:rPr>
+        <w:t>3. Build the Wheeled Base and Spine</w:t>
+      </w:r>
+    </w:p>
+    <w:p>
+      <w:pPr>
+        <w:tabs>
+          <w:tab w:pos="504" w:val="left"/>
+        </w:tabs>
+        <w:spacing w:after="80"/>
+        <w:ind w:left="504" w:hanging="504"/>
+      </w:pPr>
+      <w:r>
+        <w:rPr>
+          <w:b w:val="0"/>
+          <w:i w:val="0"/>
+        </w:rPr>
+        <w:t>1.</w:t>
+        <w:tab/>
+        <w:t>Cut 9-mm plywood: bottom and top 40 × 40 cm; four sides 40 × 12 cm (two of them 38.2 × 12 cm). Glue and screw the sides to the bottom. Keep the top removable (4 screws).</w:t>
+      </w:r>
+    </w:p>
+    <w:p>
+      <w:pPr>
+        <w:tabs>
+          <w:tab w:pos="504" w:val="left"/>
+        </w:tabs>
+        <w:spacing w:after="80"/>
+        <w:ind w:left="504" w:hanging="504"/>
+      </w:pPr>
+      <w:r>
+        <w:rPr>
+          <w:b w:val="0"/>
+          <w:i w:val="0"/>
+        </w:rPr>
+        <w:t>2.</w:t>
+        <w:tab/>
+        <w:t>Motors: bolt one motor bracket under each rear corner so the wheels stick out about 1 cm past the sides and touch the floor. Fit the wheels with the couplers.</w:t>
+      </w:r>
+    </w:p>
+    <w:p>
+      <w:pPr>
+        <w:tabs>
+          <w:tab w:pos="504" w:val="left"/>
+        </w:tabs>
+        <w:spacing w:after="80"/>
+        <w:ind w:left="504" w:hanging="504"/>
+      </w:pPr>
+      <w:r>
+        <w:rPr>
+          <w:b w:val="0"/>
+          <w:i w:val="0"/>
+        </w:rPr>
+        <w:t>3.</w:t>
+        <w:tab/>
+        <w:t>Caster: screw the 2-in swivel caster under the front center. Adjust with washers until the base sits level with the line sensor about 1 cm above the floor.</w:t>
+      </w:r>
+    </w:p>
+    <w:p>
+      <w:pPr>
+        <w:tabs>
+          <w:tab w:pos="504" w:val="left"/>
+        </w:tabs>
+        <w:spacing w:after="80"/>
+        <w:ind w:left="504" w:hanging="504"/>
+      </w:pPr>
+      <w:r>
+        <w:rPr>
+          <w:b w:val="0"/>
+          <w:i w:val="0"/>
+        </w:rPr>
+        <w:t>4.</w:t>
+        <w:tab/>
+        <w:t>Front: screw the 5-channel line sensor under the front edge, sensors down, 1 cm above the floor. Mount the HC-SR04 on the front side panel, pointing forward. Make a bumper from a 30-cm strip of thin plywood on two lever microswitches across the front, so a light push closes a switch.</w:t>
+      </w:r>
+    </w:p>
+    <w:p>
+      <w:pPr>
+        <w:tabs>
+          <w:tab w:pos="504" w:val="left"/>
+        </w:tabs>
+        <w:spacing w:after="80"/>
+        <w:ind w:left="504" w:hanging="504"/>
+      </w:pPr>
+      <w:r>
+        <w:rPr>
+          <w:b w:val="0"/>
+          <w:i w:val="0"/>
+        </w:rPr>
+        <w:t>5.</w:t>
+        <w:tab/>
+        <w:t>Inside: fix the battery between the wheels (as low as possible), then the fuse holder, switch, LM2596, L298N, and D4184. Drill the switch hole in a side panel.</w:t>
+      </w:r>
+    </w:p>
+    <w:p>
+      <w:pPr>
+        <w:tabs>
+          <w:tab w:pos="504" w:val="left"/>
+        </w:tabs>
+        <w:spacing w:after="80"/>
+        <w:ind w:left="504" w:hanging="504"/>
+      </w:pPr>
+      <w:r>
+        <w:rPr>
+          <w:b w:val="0"/>
+          <w:i w:val="0"/>
+        </w:rPr>
+        <w:t>6.</w:t>
+        <w:tab/>
+        <w:t>Fan: cut a hole in the top board for the blower outlet, 8 cm from the center, and hot-glue the blower under it, outlet up. Drill air holes in a side panel near the fan intake and fit the finger guard.</w:t>
+      </w:r>
+    </w:p>
+    <w:p>
+      <w:pPr>
+        <w:tabs>
+          <w:tab w:pos="504" w:val="left"/>
+        </w:tabs>
+        <w:spacing w:after="80"/>
+        <w:ind w:left="504" w:hanging="504"/>
+      </w:pPr>
+      <w:r>
+        <w:rPr>
+          <w:b w:val="0"/>
+          <w:i w:val="0"/>
+        </w:rPr>
+        <w:t>7.</w:t>
+        <w:tab/>
+        <w:t>Spine: screw the PVC floor flange to the center of the top board. Build the spine: 62-cm pipe, T (side outlet facing forward), 25-cm pipe on top. Add a 6-cm pipe and end cap to the T. Run the ribbon cable and the 5 V/GND wires up the pipe and out through a hole in the end cap.</w:t>
       </w:r>
     </w:p>
     <w:p>
@@ -2262,221 +2122,7 @@
         </w:rPr>
         <w:t>8.</w:t>
         <w:tab/>
-        <w:t>Neck tube: fold the 40 × 14 cm piece and sew the 14-cm edges together to make a tube 12 cm wide. Sew one end to the body's neck hole and the other end to the head's hole. Air now flows from the body into the head.</w:t>
-      </w:r>
-    </w:p>
-    <w:p>
-      <w:pPr>
-        <w:tabs>
-          <w:tab w:pos="504" w:val="left"/>
-        </w:tabs>
-        <w:spacing w:after="80"/>
-        <w:ind w:left="504" w:hanging="504"/>
-      </w:pPr>
-      <w:r>
-        <w:rPr>
-          <w:b w:val="0"/>
-          <w:i w:val="0"/>
-        </w:rPr>
-        <w:t>9.</w:t>
-        <w:tab/>
-        <w:t>Sew or glue the two black felt eyes on the head, about 6 cm apart. Keep the face simple (two dots).</w:t>
-      </w:r>
-    </w:p>
-    <w:p>
-      <w:pPr>
-        <w:tabs>
-          <w:tab w:pos="504" w:val="left"/>
-        </w:tabs>
-        <w:spacing w:after="80"/>
-        <w:ind w:left="504" w:hanging="504"/>
-      </w:pPr>
-      <w:r>
-        <w:rPr>
-          <w:b w:val="0"/>
-          <w:i w:val="0"/>
-        </w:rPr>
-        <w:t>10.</w:t>
-        <w:tab/>
-        <w:t>Bottom opening: fold the edge over 2 cm and sew a hem. You will staple this hem to the base top.</w:t>
-      </w:r>
-    </w:p>
-    <w:p>
-      <w:pPr>
-        <w:tabs>
-          <w:tab w:pos="504" w:val="left"/>
-        </w:tabs>
-        <w:spacing w:after="80"/>
-        <w:ind w:left="504" w:hanging="504"/>
-      </w:pPr>
-      <w:r>
-        <w:rPr>
-          <w:b w:val="0"/>
-          <w:i w:val="0"/>
-        </w:rPr>
-        <w:t>11.</w:t>
-        <w:tab/>
-        <w:t>Seal the long seams on the inside with seam sealer or fabric glue if the body goes soft too fast.</w:t>
-      </w:r>
-    </w:p>
-    <w:p>
-      <w:pPr>
-        <w:keepNext/>
-        <w:pageBreakBefore/>
-        <w:spacing w:after="120"/>
-      </w:pPr>
-      <w:r>
-        <w:rPr>
-          <w:b/>
-          <w:i w:val="0"/>
-          <w:color w:val="1F2A44"/>
-          <w:sz w:val="30"/>
-        </w:rPr>
-        <w:t>3. Build the Base Box and Spine</w:t>
-      </w:r>
-    </w:p>
-    <w:p>
-      <w:pPr>
-        <w:tabs>
-          <w:tab w:pos="504" w:val="left"/>
-        </w:tabs>
-        <w:spacing w:after="80"/>
-        <w:ind w:left="504" w:hanging="504"/>
-      </w:pPr>
-      <w:r>
-        <w:rPr>
-          <w:b w:val="0"/>
-          <w:i w:val="0"/>
-        </w:rPr>
-        <w:t>1.</w:t>
-        <w:tab/>
-        <w:t>Cut 12-mm plywood: top and bottom 40 × 40 cm, four sides 40 × 15 cm (two of them 37.6 × 15 cm so the box comes out square). Screw and glue the sides to the bottom. Keep the top removable (4 screws).</w:t>
-      </w:r>
-    </w:p>
-    <w:p>
-      <w:pPr>
-        <w:tabs>
-          <w:tab w:pos="504" w:val="left"/>
-        </w:tabs>
-        <w:spacing w:after="80"/>
-        <w:ind w:left="504" w:hanging="504"/>
-      </w:pPr>
-      <w:r>
-        <w:rPr>
-          <w:b w:val="0"/>
-          <w:i w:val="0"/>
-        </w:rPr>
-        <w:t>2.</w:t>
-        <w:tab/>
-        <w:t>Fan hole: in the top board, 8 cm from the center, cut a hole the size of the blower's outlet. Hot-glue the blower under the top board with its outlet pointing up through the hole. Seal gaps with hot glue.</w:t>
-      </w:r>
-    </w:p>
-    <w:p>
-      <w:pPr>
-        <w:tabs>
-          <w:tab w:pos="504" w:val="left"/>
-        </w:tabs>
-        <w:spacing w:after="80"/>
-        <w:ind w:left="504" w:hanging="504"/>
-      </w:pPr>
-      <w:r>
-        <w:rPr>
-          <w:b w:val="0"/>
-          <w:i w:val="0"/>
-        </w:rPr>
-        <w:t>3.</w:t>
-        <w:tab/>
-        <w:t>Fan air intake: drill about 20 holes of 8 mm in one side of the box near the fan, and put the finger guard on the fan's intake.</w:t>
-      </w:r>
-    </w:p>
-    <w:p>
-      <w:pPr>
-        <w:tabs>
-          <w:tab w:pos="504" w:val="left"/>
-        </w:tabs>
-        <w:spacing w:after="80"/>
-        <w:ind w:left="504" w:hanging="504"/>
-      </w:pPr>
-      <w:r>
-        <w:rPr>
-          <w:b w:val="0"/>
-          <w:i w:val="0"/>
-        </w:rPr>
-        <w:t>4.</w:t>
-        <w:tab/>
-        <w:t>Spine: screw the PVC floor flange to the center of the top board. Cut a 40-cm PVC pipe, then a T, then a 35-cm pipe above it (total about 78 cm). The T's side outlet points forward at 40 cm, in line with the grommet. Add a 6-cm pipe and end cap to the T's side outlet. Drill a hole through the end cap for the cable.</w:t>
-      </w:r>
-    </w:p>
-    <w:p>
-      <w:pPr>
-        <w:tabs>
-          <w:tab w:pos="504" w:val="left"/>
-        </w:tabs>
-        <w:spacing w:after="80"/>
-        <w:ind w:left="504" w:hanging="504"/>
-      </w:pPr>
-      <w:r>
-        <w:rPr>
-          <w:b w:val="0"/>
-          <w:i w:val="0"/>
-        </w:rPr>
-        <w:t>5.</w:t>
-        <w:tab/>
-        <w:t>Mount the battery, fuse holder, rocker switch, LM2596, and D4184 module inside the base box with screws or Velcro. Drill the rocker switch hole in a side panel.</w:t>
-      </w:r>
-    </w:p>
-    <w:p>
-      <w:pPr>
-        <w:tabs>
-          <w:tab w:pos="504" w:val="left"/>
-        </w:tabs>
-        <w:spacing w:after="80"/>
-        <w:ind w:left="504" w:hanging="504"/>
-      </w:pPr>
-      <w:r>
-        <w:rPr>
-          <w:b w:val="0"/>
-          <w:i w:val="0"/>
-        </w:rPr>
-        <w:t>6.</w:t>
-        <w:tab/>
-        <w:t>Feed the 3-core cable (5 V, GND, FAN) from the base, up the spine, and out of the T's end cap.</w:t>
-      </w:r>
-    </w:p>
-    <w:p>
-      <w:pPr>
-        <w:tabs>
-          <w:tab w:pos="504" w:val="left"/>
-        </w:tabs>
-        <w:spacing w:after="80"/>
-        <w:ind w:left="504" w:hanging="504"/>
-      </w:pPr>
-      <w:r>
-        <w:rPr>
-          <w:b w:val="0"/>
-          <w:i w:val="0"/>
-        </w:rPr>
-        <w:t>7.</w:t>
-        <w:tab/>
-        <w:t>Place the body over the spine so the spine goes inside the body and the end cap meets the grommet. Staple the bottom hem of the body to the edge of the top board (every 3 cm), with the fan hole inside the opening.</w:t>
-      </w:r>
-    </w:p>
-    <w:p>
-      <w:pPr>
-        <w:tabs>
-          <w:tab w:pos="504" w:val="left"/>
-        </w:tabs>
-        <w:spacing w:after="80"/>
-        <w:ind w:left="504" w:hanging="504"/>
-      </w:pPr>
-      <w:r>
-        <w:rPr>
-          <w:b w:val="0"/>
-          <w:i w:val="0"/>
-        </w:rPr>
-        <w:t>8.</w:t>
-        <w:tab/>
-        <w:t>Push the speaker into the top of the spine pipe and zip-tie it; run its two wires down the pipe to the T.</w:t>
+        <w:t>Pull the body over the spine so the end cap meets the grommet, and staple the bottom hem around the edge of the top board every 3 cm. Zip-tie the speaker to the top of the spine.</w:t>
       </w:r>
     </w:p>
     <w:p>
@@ -2503,7 +2149,7 @@
       <w:r>
         <w:drawing>
           <wp:inline xmlns:a="http://schemas.openxmlformats.org/drawingml/2006/main" xmlns:pic="http://schemas.openxmlformats.org/drawingml/2006/picture">
-            <wp:extent cx="6217920" cy="4610646"/>
+            <wp:extent cx="6309360" cy="4927886"/>
             <wp:docPr id="3" name="Picture 3"/>
             <wp:cNvGraphicFramePr>
               <a:graphicFrameLocks noChangeAspect="1"/>
@@ -2524,7 +2170,7 @@
                   <pic:spPr>
                     <a:xfrm>
                       <a:off x="0" y="0"/>
-                      <a:ext cx="6217920" cy="4610646"/>
+                      <a:ext cx="6309360" cy="4927886"/>
                     </a:xfrm>
                     <a:prstGeom prst="rect"/>
                   </pic:spPr>
@@ -2546,22 +2192,7 @@
           <w:i/>
           <w:sz w:val="20"/>
         </w:rPr>
-        <w:t>Figure B. Wiring of ALAGA. All grounds (GND) must be connected together.</w:t>
-      </w:r>
-    </w:p>
-    <w:p>
-      <w:pPr>
-        <w:keepNext/>
-        <w:spacing w:after="60" w:before="160"/>
-      </w:pPr>
-      <w:r>
-        <w:rPr>
-          <w:b/>
-          <w:i w:val="0"/>
-          <w:color w:val="1F2A44"/>
-          <w:sz w:val="25"/>
-        </w:rPr>
-        <w:t>Base box (power)</w:t>
+        <w:t>Figure B. Wiring of ALAGA and its pendant. All grounds (GND) are joined together.</w:t>
       </w:r>
     </w:p>
     <w:p>
@@ -2579,7 +2210,7 @@
         </w:rPr>
         <w:t>1.</w:t>
         <w:tab/>
-        <w:t>Battery + → fuse holder (3 A) → rocker switch → “12 V” point. Battery – → “GND” point.</w:t>
+        <w:t>Power: battery + → 3 A fuse → rocker switch → 12 V bus; battery – → GND bus. Connect the 12 V and GND buses to the LM2596 input, the L298N +12V/GND, and the D4184 VIN.</w:t>
       </w:r>
     </w:p>
     <w:p>
@@ -2597,7 +2228,7 @@
         </w:rPr>
         <w:t>2.</w:t>
         <w:tab/>
-        <w:t>12 V and GND → LM2596 IN+ and IN–. Switch on. Turn the LM2596 screw until the multimeter reads 5.0 V at OUT+ and OUT–. Switch off.</w:t>
+        <w:t>Switch on, turn the LM2596 screw until its output reads 5.0 V, switch off. Then connect 5 V to ESP32 VIN, DFPlayer VCC, and HC-SR04 VCC.</w:t>
       </w:r>
     </w:p>
     <w:p>
@@ -2615,7 +2246,7 @@
         </w:rPr>
         <w:t>3.</w:t>
         <w:tab/>
-        <w:t>12 V and GND → D4184 VIN+ and VIN–. D4184 OUT+ and OUT– → fan red and black. Solder the 1N5819 diode across the fan wires: stripe (cathode) to the red wire.</w:t>
+        <w:t>Motors: left motor to L298N OUT1/OUT2, right motor to OUT3/OUT4. Remove the ENA and ENB jumpers and wire ENA, IN1, IN2, ENB, IN3, IN4 to GPIO 14, 18, 19, 23, 5, 15.</w:t>
       </w:r>
     </w:p>
     <w:p>
@@ -2633,7 +2264,95 @@
         </w:rPr>
         <w:t>4.</w:t>
         <w:tab/>
-        <w:t>3-core cable: red to LM2596 OUT+ (5 V); black to GND; yellow to the D4184 PWM/SIG pin. Also connect the D4184 GND pin to GND.</w:t>
+        <w:t>Fan: D4184 OUT+/OUT– to the fan, 1N5819 across the fan (stripe to +), PWM to GPIO 25.</w:t>
+      </w:r>
+    </w:p>
+    <w:p>
+      <w:pPr>
+        <w:tabs>
+          <w:tab w:pos="504" w:val="left"/>
+        </w:tabs>
+        <w:spacing w:after="80"/>
+        <w:ind w:left="504" w:hanging="504"/>
+      </w:pPr>
+      <w:r>
+        <w:rPr>
+          <w:b w:val="0"/>
+          <w:i w:val="0"/>
+        </w:rPr>
+        <w:t>5.</w:t>
+        <w:tab/>
+        <w:t>Front sensors: line sensor L1 (left) to L5 (right) → GPIO 35, 36, 39, 4, 13, powered from 3V3. HC-SR04 TRIG → 32; ECHO → 1 kΩ → GPIO 33, and GPIO 33 → 2 kΩ → GND. Bumper switches: COM to GND, NO to GPIO 2.</w:t>
+      </w:r>
+    </w:p>
+    <w:p>
+      <w:pPr>
+        <w:tabs>
+          <w:tab w:pos="504" w:val="left"/>
+        </w:tabs>
+        <w:spacing w:after="80"/>
+        <w:ind w:left="504" w:hanging="504"/>
+      </w:pPr>
+      <w:r>
+        <w:rPr>
+          <w:b w:val="0"/>
+          <w:i w:val="0"/>
+        </w:rPr>
+        <w:t>6.</w:t>
+        <w:tab/>
+        <w:t>Chest box: cut holes for the OLED, MLX90614 (near the top), finger slot, dial, red button, sound sensor, and cable. Solder the ESP32 on perfboard with female headers. Wire the I²C parts (MLX90614, MAX30102, OLED) to 3V3, GND, SDA 21, SCL 22; the DFPlayer TX → 16 and RX ← 1 kΩ ← 17; dial wiper → 34; button → 27 and GND; KY-037 D0 → 26.</w:t>
+      </w:r>
+    </w:p>
+    <w:p>
+      <w:pPr>
+        <w:tabs>
+          <w:tab w:pos="504" w:val="left"/>
+        </w:tabs>
+        <w:spacing w:after="80"/>
+        <w:ind w:left="504" w:hanging="504"/>
+      </w:pPr>
+      <w:r>
+        <w:rPr>
+          <w:b w:val="0"/>
+          <w:i w:val="0"/>
+        </w:rPr>
+        <w:t>7.</w:t>
+        <w:tab/>
+        <w:t>Finger slot: glue the MAX30102 face up at the bottom of a 2-cm slot lined with black foam to block light.</w:t>
+      </w:r>
+    </w:p>
+    <w:p>
+      <w:pPr>
+        <w:tabs>
+          <w:tab w:pos="504" w:val="left"/>
+        </w:tabs>
+        <w:spacing w:after="80"/>
+        <w:ind w:left="504" w:hanging="504"/>
+      </w:pPr>
+      <w:r>
+        <w:rPr>
+          <w:b w:val="0"/>
+          <w:i w:val="0"/>
+        </w:rPr>
+        <w:t>8.</w:t>
+        <w:tab/>
+        <w:t>Pendant: solder the LiPo to the TP4056 B+/B–, TP4056 OUT+/OUT– to the ESP32-C3 5V and GND, the MPU6050 to 3V3, GND, GPIO 6 (SDA), and GPIO 7 (SCL), the button between GPIO 3 and GND, and the buzzer between GPIO 4 and GND. Fit it in a small box on a breakaway neck cord with the TP4056 USB port reachable.</w:t>
+      </w:r>
+    </w:p>
+    <w:p>
+      <w:pPr>
+        <w:keepNext/>
+        <w:pageBreakBefore/>
+        <w:spacing w:after="120"/>
+      </w:pPr>
+      <w:r>
+        <w:rPr>
+          <w:b/>
+          <w:i w:val="0"/>
+          <w:color w:val="1F2A44"/>
+          <w:sz w:val="30"/>
+        </w:rPr>
+        <w:t>5. Program the Robot and the Pendant</w:t>
       </w:r>
     </w:p>
     <w:p>
@@ -2648,7 +2367,7 @@
           <w:color w:val="1F2A44"/>
           <w:sz w:val="25"/>
         </w:rPr>
-        <w:t>Chest box (controller and sensors)</w:t>
+        <w:t>Set up Telegram for the family</w:t>
       </w:r>
     </w:p>
     <w:p>
@@ -2666,7 +2385,7 @@
         </w:rPr>
         <w:t>1.</w:t>
         <w:tab/>
-        <w:t>Cut holes in the lid of the project box: a window for the OLED, two 16-mm holes for the HC-SR04, a 10-mm hole for the MLX90614 (all three near the top edge), a slot for the MAX30102 finger cradle, holes for the dial and the arcade button, and small holes for the sound sensor.</w:t>
+        <w:t>In Telegram, open @BotFather, send /newbot, and follow the steps. Copy the bot token it gives.</w:t>
       </w:r>
     </w:p>
     <w:p>
@@ -2684,7 +2403,7 @@
         </w:rPr>
         <w:t>2.</w:t>
         <w:tab/>
-        <w:t>Solder the ESP32 onto the perfboard with female headers so it can be removed.</w:t>
+        <w:t>Create a group (e.g., “Bantay kay Lola”), add the family members and the new bot.</w:t>
       </w:r>
     </w:p>
     <w:p>
@@ -2702,7 +2421,76 @@
         </w:rPr>
         <w:t>3.</w:t>
         <w:tab/>
-        <w:t>Make the HC-SR04 echo divider on the perfboard: ECHO → 1 kΩ → GPIO 33, and GPIO 33 → 2 kΩ → GND.</w:t>
+        <w:t>Send any message in the group, then open https://api.telegram.org/bot&lt;TOKEN&gt;/getUpdates in a browser. The number after "chat":{"id": is the group chat id (it starts with a minus sign).</w:t>
+      </w:r>
+    </w:p>
+    <w:p>
+      <w:pPr>
+        <w:keepNext/>
+        <w:spacing w:after="60" w:before="160"/>
+      </w:pPr>
+      <w:r>
+        <w:rPr>
+          <w:b/>
+          <w:i w:val="0"/>
+          <w:color w:val="1F2A44"/>
+          <w:sz w:val="25"/>
+        </w:rPr>
+        <w:t>Upload the programs</w:t>
+      </w:r>
+    </w:p>
+    <w:p>
+      <w:pPr>
+        <w:tabs>
+          <w:tab w:pos="504" w:val="left"/>
+        </w:tabs>
+        <w:spacing w:after="80"/>
+        <w:ind w:left="504" w:hanging="504"/>
+      </w:pPr>
+      <w:r>
+        <w:rPr>
+          <w:b w:val="0"/>
+          <w:i w:val="0"/>
+        </w:rPr>
+        <w:t>1.</w:t>
+        <w:tab/>
+        <w:t>Install Arduino IDE 2. In Boards Manager, install “esp32 by Espressif Systems” (add https://espressif.github.io/arduino-esp32/package_esp32_index.json in Preferences first).</w:t>
+      </w:r>
+    </w:p>
+    <w:p>
+      <w:pPr>
+        <w:tabs>
+          <w:tab w:pos="504" w:val="left"/>
+        </w:tabs>
+        <w:spacing w:after="80"/>
+        <w:ind w:left="504" w:hanging="504"/>
+      </w:pPr>
+      <w:r>
+        <w:rPr>
+          <w:b w:val="0"/>
+          <w:i w:val="0"/>
+        </w:rPr>
+        <w:t>2.</w:t>
+        <w:tab/>
+        <w:t>In Library Manager, install: Adafruit MLX90614 Library, SparkFun MAX3010x Pulse and Proximity Sensor Library, Adafruit SSD1306, Adafruit GFX Library, DFRobotDFPlayerMini, UniversalTelegramBot, and ArduinoJson.</w:t>
+      </w:r>
+    </w:p>
+    <w:p>
+      <w:pPr>
+        <w:tabs>
+          <w:tab w:pos="504" w:val="left"/>
+        </w:tabs>
+        <w:spacing w:after="80"/>
+        <w:ind w:left="504" w:hanging="504"/>
+      </w:pPr>
+      <w:r>
+        <w:rPr>
+          <w:b w:val="0"/>
+          <w:i w:val="0"/>
+        </w:rPr>
+        <w:t>3.</w:t>
+        <w:tab/>
+        <w:t>Open firmware/alaga/alaga.ino. At the top, type the Wi-Fi name and password, the bot token, the group chat id, the older adult's name, and the schedule (hour, minute, task).</w:t>
       </w:r>
     </w:p>
     <w:p>
@@ -2720,7 +2508,7 @@
         </w:rPr>
         <w:t>4.</w:t>
         <w:tab/>
-        <w:t>Connect the I²C bus: MLX90614, MAX30102, and OLED all to 3V3, GND, SDA (GPIO 21), and SCL (GPIO 22).</w:t>
+        <w:t>Board: ESP32 Dev Module. Upload with the wheels lifted. Open Serial Monitor at 115200 and note the Wi-Fi channel it prints. The group should receive “ALAGA is on duty…”.</w:t>
       </w:r>
     </w:p>
     <w:p>
@@ -2738,7 +2526,7 @@
         </w:rPr>
         <w:t>5.</w:t>
         <w:tab/>
-        <w:t>Connect the rest using the pin table below. Use red for power, black for GND, other colors for signals.</w:t>
+        <w:t>Open firmware/alaga_pendant/alaga_pendant.ino, set WIFI_CHANNEL to that channel, select ESP32C3 Dev Module (USB CDC On Boot: Enabled), and upload.</w:t>
       </w:r>
     </w:p>
     <w:p>
@@ -2756,640 +2544,7 @@
         </w:rPr>
         <w:t>6.</w:t>
         <w:tab/>
-        <w:t>Finger cradle: glue the MAX30102 face-up at the bottom of a 2-cm slot, with a strip of black foam around it to block room light. A clothespin-style flap of foam on top keeps the finger still.</w:t>
-      </w:r>
-    </w:p>
-    <w:p>
-      <w:pPr>
-        <w:tabs>
-          <w:tab w:pos="504" w:val="left"/>
-        </w:tabs>
-        <w:spacing w:after="80"/>
-        <w:ind w:left="504" w:hanging="504"/>
-      </w:pPr>
-      <w:r>
-        <w:rPr>
-          <w:b w:val="0"/>
-          <w:i w:val="0"/>
-        </w:rPr>
-        <w:t>7.</w:t>
-        <w:tab/>
-        <w:t>Bring the 3-core cable from the spine into the back of the box: red → ESP32 VIN, black → ESP32 GND, yellow → GPIO 25. Connect the speaker wires to DFPlayer SPK1 and SPK2.</w:t>
-      </w:r>
-    </w:p>
-    <w:p>
-      <w:pPr>
-        <w:tabs>
-          <w:tab w:pos="504" w:val="left"/>
-        </w:tabs>
-        <w:spacing w:after="80"/>
-        <w:ind w:left="504" w:hanging="504"/>
-      </w:pPr>
-      <w:r>
-        <w:rPr>
-          <w:b w:val="0"/>
-          <w:i w:val="0"/>
-        </w:rPr>
-        <w:t>8.</w:t>
-        <w:tab/>
-        <w:t>Screw the chest box to the PVC end cap through the grommet, with the sensors facing out.</w:t>
-      </w:r>
-    </w:p>
-    <w:tbl>
-      <w:tblPr>
-        <w:tblStyle w:val="TableGrid"/>
-        <w:tblW w:type="auto" w:w="0"/>
-        <w:jc w:val="center"/>
-        <w:tblLayout w:type="fixed"/>
-        <w:tblLook w:firstColumn="1" w:firstRow="1" w:lastColumn="0" w:lastRow="0" w:noHBand="0" w:noVBand="1" w:val="04A0"/>
-      </w:tblPr>
-      <w:tblGrid>
-        <w:gridCol w:w="2880"/>
-        <w:gridCol w:w="2880"/>
-        <w:gridCol w:w="3888"/>
-      </w:tblGrid>
-      <w:tr>
-        <w:tc>
-          <w:tcPr>
-            <w:tcW w:type="dxa" w:w="2880"/>
-            <w:shd w:val="clear" w:fill="1F2A44"/>
-          </w:tcPr>
-          <w:p>
-            <w:pPr>
-              <w:spacing w:after="0" w:line="240" w:lineRule="auto"/>
-            </w:pPr>
-            <w:r/>
-            <w:r>
-              <w:rPr>
-                <w:b/>
-                <w:color w:val="FFFFFF"/>
-                <w:sz w:val="19"/>
-              </w:rPr>
-              <w:t>Part</w:t>
-            </w:r>
-          </w:p>
-        </w:tc>
-        <w:tc>
-          <w:tcPr>
-            <w:tcW w:type="dxa" w:w="2880"/>
-            <w:shd w:val="clear" w:fill="1F2A44"/>
-          </w:tcPr>
-          <w:p>
-            <w:pPr>
-              <w:spacing w:after="0" w:line="240" w:lineRule="auto"/>
-            </w:pPr>
-            <w:r/>
-            <w:r>
-              <w:rPr>
-                <w:b/>
-                <w:color w:val="FFFFFF"/>
-                <w:sz w:val="19"/>
-              </w:rPr>
-              <w:t>Part pin</w:t>
-            </w:r>
-          </w:p>
-        </w:tc>
-        <w:tc>
-          <w:tcPr>
-            <w:tcW w:type="dxa" w:w="3888"/>
-            <w:shd w:val="clear" w:fill="1F2A44"/>
-          </w:tcPr>
-          <w:p>
-            <w:pPr>
-              <w:spacing w:after="0" w:line="240" w:lineRule="auto"/>
-            </w:pPr>
-            <w:r/>
-            <w:r>
-              <w:rPr>
-                <w:b/>
-                <w:color w:val="FFFFFF"/>
-                <w:sz w:val="19"/>
-              </w:rPr>
-              <w:t>Connect to</w:t>
-            </w:r>
-          </w:p>
-        </w:tc>
-      </w:tr>
-      <w:tr>
-        <w:tc>
-          <w:tcPr>
-            <w:tcW w:type="dxa" w:w="2880"/>
-          </w:tcPr>
-          <w:p>
-            <w:pPr>
-              <w:spacing w:after="0" w:line="240" w:lineRule="auto"/>
-            </w:pPr>
-            <w:r/>
-            <w:r>
-              <w:rPr>
-                <w:b w:val="0"/>
-                <w:sz w:val="19"/>
-              </w:rPr>
-              <w:t>MLX90614, MAX30102, OLED</w:t>
-            </w:r>
-          </w:p>
-        </w:tc>
-        <w:tc>
-          <w:tcPr>
-            <w:tcW w:type="dxa" w:w="2880"/>
-          </w:tcPr>
-          <w:p>
-            <w:pPr>
-              <w:spacing w:after="0" w:line="240" w:lineRule="auto"/>
-            </w:pPr>
-            <w:r/>
-            <w:r>
-              <w:rPr>
-                <w:b w:val="0"/>
-                <w:sz w:val="19"/>
-              </w:rPr>
-              <w:t>VIN/VCC, GND, SDA, SCL</w:t>
-            </w:r>
-          </w:p>
-        </w:tc>
-        <w:tc>
-          <w:tcPr>
-            <w:tcW w:type="dxa" w:w="3888"/>
-          </w:tcPr>
-          <w:p>
-            <w:pPr>
-              <w:spacing w:after="0" w:line="240" w:lineRule="auto"/>
-            </w:pPr>
-            <w:r/>
-            <w:r>
-              <w:rPr>
-                <w:b w:val="0"/>
-                <w:sz w:val="19"/>
-              </w:rPr>
-              <w:t>3V3, GND, GPIO 21, GPIO 22</w:t>
-            </w:r>
-          </w:p>
-        </w:tc>
-      </w:tr>
-      <w:tr>
-        <w:tc>
-          <w:tcPr>
-            <w:tcW w:type="dxa" w:w="2880"/>
-          </w:tcPr>
-          <w:p>
-            <w:pPr>
-              <w:spacing w:after="0" w:line="240" w:lineRule="auto"/>
-            </w:pPr>
-            <w:r/>
-            <w:r>
-              <w:rPr>
-                <w:b w:val="0"/>
-                <w:sz w:val="19"/>
-              </w:rPr>
-              <w:t>HC-SR04</w:t>
-            </w:r>
-          </w:p>
-        </w:tc>
-        <w:tc>
-          <w:tcPr>
-            <w:tcW w:type="dxa" w:w="2880"/>
-          </w:tcPr>
-          <w:p>
-            <w:pPr>
-              <w:spacing w:after="0" w:line="240" w:lineRule="auto"/>
-            </w:pPr>
-            <w:r/>
-            <w:r>
-              <w:rPr>
-                <w:b w:val="0"/>
-                <w:sz w:val="19"/>
-              </w:rPr>
-              <w:t>VCC, GND, TRIG, ECHO</w:t>
-            </w:r>
-          </w:p>
-        </w:tc>
-        <w:tc>
-          <w:tcPr>
-            <w:tcW w:type="dxa" w:w="3888"/>
-          </w:tcPr>
-          <w:p>
-            <w:pPr>
-              <w:spacing w:after="0" w:line="240" w:lineRule="auto"/>
-            </w:pPr>
-            <w:r/>
-            <w:r>
-              <w:rPr>
-                <w:b w:val="0"/>
-                <w:sz w:val="19"/>
-              </w:rPr>
-              <w:t>5 V, GND, GPIO 32, divider → GPIO 33</w:t>
-            </w:r>
-          </w:p>
-        </w:tc>
-      </w:tr>
-      <w:tr>
-        <w:tc>
-          <w:tcPr>
-            <w:tcW w:type="dxa" w:w="2880"/>
-          </w:tcPr>
-          <w:p>
-            <w:pPr>
-              <w:spacing w:after="0" w:line="240" w:lineRule="auto"/>
-            </w:pPr>
-            <w:r/>
-            <w:r>
-              <w:rPr>
-                <w:b w:val="0"/>
-                <w:sz w:val="19"/>
-              </w:rPr>
-              <w:t>DFPlayer Mini</w:t>
-            </w:r>
-          </w:p>
-        </w:tc>
-        <w:tc>
-          <w:tcPr>
-            <w:tcW w:type="dxa" w:w="2880"/>
-          </w:tcPr>
-          <w:p>
-            <w:pPr>
-              <w:spacing w:after="0" w:line="240" w:lineRule="auto"/>
-            </w:pPr>
-            <w:r/>
-            <w:r>
-              <w:rPr>
-                <w:b w:val="0"/>
-                <w:sz w:val="19"/>
-              </w:rPr>
-              <w:t>VCC, GND, TX, RX</w:t>
-            </w:r>
-          </w:p>
-        </w:tc>
-        <w:tc>
-          <w:tcPr>
-            <w:tcW w:type="dxa" w:w="3888"/>
-          </w:tcPr>
-          <w:p>
-            <w:pPr>
-              <w:spacing w:after="0" w:line="240" w:lineRule="auto"/>
-            </w:pPr>
-            <w:r/>
-            <w:r>
-              <w:rPr>
-                <w:b w:val="0"/>
-                <w:sz w:val="19"/>
-              </w:rPr>
-              <w:t>5 V, GND, GPIO 16, 1 kΩ → GPIO 17</w:t>
-            </w:r>
-          </w:p>
-        </w:tc>
-      </w:tr>
-      <w:tr>
-        <w:tc>
-          <w:tcPr>
-            <w:tcW w:type="dxa" w:w="2880"/>
-          </w:tcPr>
-          <w:p>
-            <w:pPr>
-              <w:spacing w:after="0" w:line="240" w:lineRule="auto"/>
-            </w:pPr>
-            <w:r/>
-            <w:r>
-              <w:rPr>
-                <w:b w:val="0"/>
-                <w:sz w:val="19"/>
-              </w:rPr>
-              <w:t>Pain dial (10 kΩ)</w:t>
-            </w:r>
-          </w:p>
-        </w:tc>
-        <w:tc>
-          <w:tcPr>
-            <w:tcW w:type="dxa" w:w="2880"/>
-          </w:tcPr>
-          <w:p>
-            <w:pPr>
-              <w:spacing w:after="0" w:line="240" w:lineRule="auto"/>
-            </w:pPr>
-            <w:r/>
-            <w:r>
-              <w:rPr>
-                <w:b w:val="0"/>
-                <w:sz w:val="19"/>
-              </w:rPr>
-              <w:t>two ends, middle</w:t>
-            </w:r>
-          </w:p>
-        </w:tc>
-        <w:tc>
-          <w:tcPr>
-            <w:tcW w:type="dxa" w:w="3888"/>
-          </w:tcPr>
-          <w:p>
-            <w:pPr>
-              <w:spacing w:after="0" w:line="240" w:lineRule="auto"/>
-            </w:pPr>
-            <w:r/>
-            <w:r>
-              <w:rPr>
-                <w:b w:val="0"/>
-                <w:sz w:val="19"/>
-              </w:rPr>
-              <w:t>3V3 and GND, GPIO 34</w:t>
-            </w:r>
-          </w:p>
-        </w:tc>
-      </w:tr>
-      <w:tr>
-        <w:tc>
-          <w:tcPr>
-            <w:tcW w:type="dxa" w:w="2880"/>
-          </w:tcPr>
-          <w:p>
-            <w:pPr>
-              <w:spacing w:after="0" w:line="240" w:lineRule="auto"/>
-            </w:pPr>
-            <w:r/>
-            <w:r>
-              <w:rPr>
-                <w:b w:val="0"/>
-                <w:sz w:val="19"/>
-              </w:rPr>
-              <w:t>Arcade button</w:t>
-            </w:r>
-          </w:p>
-        </w:tc>
-        <w:tc>
-          <w:tcPr>
-            <w:tcW w:type="dxa" w:w="2880"/>
-          </w:tcPr>
-          <w:p>
-            <w:pPr>
-              <w:spacing w:after="0" w:line="240" w:lineRule="auto"/>
-            </w:pPr>
-            <w:r/>
-            <w:r>
-              <w:rPr>
-                <w:b w:val="0"/>
-                <w:sz w:val="19"/>
-              </w:rPr>
-              <w:t>two legs</w:t>
-            </w:r>
-          </w:p>
-        </w:tc>
-        <w:tc>
-          <w:tcPr>
-            <w:tcW w:type="dxa" w:w="3888"/>
-          </w:tcPr>
-          <w:p>
-            <w:pPr>
-              <w:spacing w:after="0" w:line="240" w:lineRule="auto"/>
-            </w:pPr>
-            <w:r/>
-            <w:r>
-              <w:rPr>
-                <w:b w:val="0"/>
-                <w:sz w:val="19"/>
-              </w:rPr>
-              <w:t>GPIO 27 and GND</w:t>
-            </w:r>
-          </w:p>
-        </w:tc>
-      </w:tr>
-      <w:tr>
-        <w:tc>
-          <w:tcPr>
-            <w:tcW w:type="dxa" w:w="2880"/>
-          </w:tcPr>
-          <w:p>
-            <w:pPr>
-              <w:spacing w:after="0" w:line="240" w:lineRule="auto"/>
-            </w:pPr>
-            <w:r/>
-            <w:r>
-              <w:rPr>
-                <w:b w:val="0"/>
-                <w:sz w:val="19"/>
-              </w:rPr>
-              <w:t>KY-037 sound sensor</w:t>
-            </w:r>
-          </w:p>
-        </w:tc>
-        <w:tc>
-          <w:tcPr>
-            <w:tcW w:type="dxa" w:w="2880"/>
-          </w:tcPr>
-          <w:p>
-            <w:pPr>
-              <w:spacing w:after="0" w:line="240" w:lineRule="auto"/>
-            </w:pPr>
-            <w:r/>
-            <w:r>
-              <w:rPr>
-                <w:b w:val="0"/>
-                <w:sz w:val="19"/>
-              </w:rPr>
-              <w:t>+, G, D0</w:t>
-            </w:r>
-          </w:p>
-        </w:tc>
-        <w:tc>
-          <w:tcPr>
-            <w:tcW w:type="dxa" w:w="3888"/>
-          </w:tcPr>
-          <w:p>
-            <w:pPr>
-              <w:spacing w:after="0" w:line="240" w:lineRule="auto"/>
-            </w:pPr>
-            <w:r/>
-            <w:r>
-              <w:rPr>
-                <w:b w:val="0"/>
-                <w:sz w:val="19"/>
-              </w:rPr>
-              <w:t>3V3, GND, GPIO 26</w:t>
-            </w:r>
-          </w:p>
-        </w:tc>
-      </w:tr>
-      <w:tr>
-        <w:tc>
-          <w:tcPr>
-            <w:tcW w:type="dxa" w:w="2880"/>
-          </w:tcPr>
-          <w:p>
-            <w:pPr>
-              <w:spacing w:after="0" w:line="240" w:lineRule="auto"/>
-            </w:pPr>
-            <w:r/>
-            <w:r>
-              <w:rPr>
-                <w:b w:val="0"/>
-                <w:sz w:val="19"/>
-              </w:rPr>
-              <w:t>Fan switch (via cable)</w:t>
-            </w:r>
-          </w:p>
-        </w:tc>
-        <w:tc>
-          <w:tcPr>
-            <w:tcW w:type="dxa" w:w="2880"/>
-          </w:tcPr>
-          <w:p>
-            <w:pPr>
-              <w:spacing w:after="0" w:line="240" w:lineRule="auto"/>
-            </w:pPr>
-            <w:r/>
-            <w:r>
-              <w:rPr>
-                <w:b w:val="0"/>
-                <w:sz w:val="19"/>
-              </w:rPr>
-              <w:t>D4184 PWM</w:t>
-            </w:r>
-          </w:p>
-        </w:tc>
-        <w:tc>
-          <w:tcPr>
-            <w:tcW w:type="dxa" w:w="3888"/>
-          </w:tcPr>
-          <w:p>
-            <w:pPr>
-              <w:spacing w:after="0" w:line="240" w:lineRule="auto"/>
-            </w:pPr>
-            <w:r/>
-            <w:r>
-              <w:rPr>
-                <w:b w:val="0"/>
-                <w:sz w:val="19"/>
-              </w:rPr>
-              <w:t>GPIO 25</w:t>
-            </w:r>
-          </w:p>
-        </w:tc>
-      </w:tr>
-    </w:tbl>
-    <w:p>
-      <w:pPr>
-        <w:spacing w:after="0"/>
-      </w:pPr>
-    </w:p>
-    <w:p>
-      <w:pPr>
-        <w:keepNext/>
-        <w:pageBreakBefore/>
-        <w:spacing w:after="120"/>
-      </w:pPr>
-      <w:r>
-        <w:rPr>
-          <w:b/>
-          <w:i w:val="0"/>
-          <w:color w:val="1F2A44"/>
-          <w:sz w:val="30"/>
-        </w:rPr>
-        <w:t>5. Program ALAGA</w:t>
-      </w:r>
-    </w:p>
-    <w:p>
-      <w:pPr>
-        <w:tabs>
-          <w:tab w:pos="504" w:val="left"/>
-        </w:tabs>
-        <w:spacing w:after="80"/>
-        <w:ind w:left="504" w:hanging="504"/>
-      </w:pPr>
-      <w:r>
-        <w:rPr>
-          <w:b w:val="0"/>
-          <w:i w:val="0"/>
-        </w:rPr>
-        <w:t>1.</w:t>
-        <w:tab/>
-        <w:t>Install Arduino IDE 2 on the laptop. In File → Preferences → Additional boards manager URLs, add https://espressif.github.io/arduino-esp32/package_esp32_index.json. In Boards Manager, install “esp32 by Espressif Systems”.</w:t>
-      </w:r>
-    </w:p>
-    <w:p>
-      <w:pPr>
-        <w:tabs>
-          <w:tab w:pos="504" w:val="left"/>
-        </w:tabs>
-        <w:spacing w:after="80"/>
-        <w:ind w:left="504" w:hanging="504"/>
-      </w:pPr>
-      <w:r>
-        <w:rPr>
-          <w:b w:val="0"/>
-          <w:i w:val="0"/>
-        </w:rPr>
-        <w:t>2.</w:t>
-        <w:tab/>
-        <w:t>In Library Manager, install: Adafruit MLX90614 Library, SparkFun MAX3010x Pulse and Proximity Sensor Library, Adafruit SSD1306, Adafruit GFX Library, and DFRobotDFPlayerMini.</w:t>
-      </w:r>
-    </w:p>
-    <w:p>
-      <w:pPr>
-        <w:tabs>
-          <w:tab w:pos="504" w:val="left"/>
-        </w:tabs>
-        <w:spacing w:after="80"/>
-        <w:ind w:left="504" w:hanging="504"/>
-      </w:pPr>
-      <w:r>
-        <w:rPr>
-          <w:b w:val="0"/>
-          <w:i w:val="0"/>
-        </w:rPr>
-        <w:t>3.</w:t>
-        <w:tab/>
-        <w:t>Open firmware/alaga/alaga.ino from the project folder.</w:t>
-      </w:r>
-    </w:p>
-    <w:p>
-      <w:pPr>
-        <w:tabs>
-          <w:tab w:pos="504" w:val="left"/>
-        </w:tabs>
-        <w:spacing w:after="80"/>
-        <w:ind w:left="504" w:hanging="504"/>
-      </w:pPr>
-      <w:r>
-        <w:rPr>
-          <w:b w:val="0"/>
-          <w:i w:val="0"/>
-        </w:rPr>
-        <w:t>4.</w:t>
-        <w:tab/>
-        <w:t>Select Tools → Board → ESP32 Dev Module and the correct port. Click Upload. If uploading stalls at “Connecting…”, hold the BOOT button on the ESP32 until it starts.</w:t>
-      </w:r>
-    </w:p>
-    <w:p>
-      <w:pPr>
-        <w:tabs>
-          <w:tab w:pos="504" w:val="left"/>
-        </w:tabs>
-        <w:spacing w:after="80"/>
-        <w:ind w:left="504" w:hanging="504"/>
-      </w:pPr>
-      <w:r>
-        <w:rPr>
-          <w:b w:val="0"/>
-          <w:i w:val="0"/>
-        </w:rPr>
-        <w:t>5.</w:t>
-        <w:tab/>
-        <w:t>Open Serial Monitor at 115200 baud. The OLED should show “ALAGA / Press my chest”.</w:t>
-      </w:r>
-    </w:p>
-    <w:p>
-      <w:pPr>
-        <w:tabs>
-          <w:tab w:pos="504" w:val="left"/>
-        </w:tabs>
-        <w:spacing w:after="80"/>
-        <w:ind w:left="504" w:hanging="504"/>
-      </w:pPr>
-      <w:r>
-        <w:rPr>
-          <w:b w:val="0"/>
-          <w:i w:val="0"/>
-        </w:rPr>
-        <w:t>6.</w:t>
-        <w:tab/>
-        <w:t>Check the I²C parts: upload the Arduino example File → Examples → Wire → WireScan (or any I²C scanner). It must list 0x3C (OLED), 0x57 (MAX30102), and 0x5A (MLX90614). Then upload alaga.ino again.</w:t>
+        <w:t>Test: hold the pendant button for 2 s. The robot should say the alert line and the group should get “SOS pressed…”.</w:t>
       </w:r>
     </w:p>
     <w:tbl>
@@ -3413,28 +2568,42 @@
                 <w:b/>
                 <w:sz w:val="21"/>
               </w:rPr>
-              <w:t>If 0x57 is missing:</w:t>
+              <w:t>If a motor turns backward,</w:t>
             </w:r>
             <w:r>
               <w:rPr>
                 <w:b w:val="0"/>
                 <w:sz w:val="21"/>
               </w:rPr>
-              <w:t xml:space="preserve"> some MAX30102 boards pull SDA/SCL up to 1.8 V. Buy the version with 3.3 V pull-ups, or ask the seller before buying.  </w:t>
+              <w:t xml:space="preserve"> swap its two wires at the L298N.  </w:t>
             </w:r>
             <w:r>
               <w:rPr>
                 <w:b/>
                 <w:sz w:val="21"/>
               </w:rPr>
-              <w:t>If the sound sensor wakes ALAGA by itself:</w:t>
+              <w:t>If ALAGA cannot see the tape,</w:t>
             </w:r>
             <w:r>
               <w:rPr>
                 <w:b w:val="0"/>
                 <w:sz w:val="21"/>
               </w:rPr>
-              <w:t xml:space="preserve"> turn its trimmer until the D0 LED is off in a quiet room. If its D0 goes LOW (not HIGH) when you shout, change HIGH to LOW in the line digitalRead(PIN_SOUND) == HIGH.</w:t>
+              <w:t xml:space="preserve"> turn each line-sensor trimmer until its LED lights over the tape only; for white tape on a dark floor, change LINE_ON_TAPE to LOW.  </w:t>
+            </w:r>
+            <w:r>
+              <w:rPr>
+                <w:b/>
+                <w:sz w:val="21"/>
+              </w:rPr>
+              <w:t>If 0x57 is missing in an I²C scan,</w:t>
+            </w:r>
+            <w:r>
+              <w:rPr>
+                <w:b w:val="0"/>
+                <w:sz w:val="21"/>
+              </w:rPr>
+              <w:t xml:space="preserve"> buy a MAX30102 board with 3.3 V pull-ups.</w:t>
             </w:r>
           </w:p>
         </w:tc>
@@ -3469,7 +2638,7 @@
           <w:b w:val="0"/>
           <w:i w:val="0"/>
         </w:rPr>
-        <w:t>Record each line with a phone in a quiet room, save as MP3, and copy to the microSD card (formatted FAT32) in a folder named mp3, with exactly these file names. Ask a classmate with a clear, warm voice.</w:t>
+        <w:t>Record in a quiet room, save as MP3, and copy to the microSD card (FAT32): prompts in a folder named mp3 with the exact names below, and up to five favorite songs or prayers as 02/001.mp3 to 02/005.mp3.</w:t>
       </w:r>
     </w:p>
     <w:tbl>
@@ -3499,7 +2668,7 @@
               <w:rPr>
                 <w:b/>
                 <w:color w:val="FFFFFF"/>
-                <w:sz w:val="19"/>
+                <w:sz w:val="18"/>
               </w:rPr>
               <w:t>File</w:t>
             </w:r>
@@ -3519,9 +2688,9 @@
               <w:rPr>
                 <w:b/>
                 <w:color w:val="FFFFFF"/>
-                <w:sz w:val="19"/>
+                <w:sz w:val="18"/>
               </w:rPr>
-              <w:t>Filipino, then English</w:t>
+              <w:t>What ALAGA says (Filipino, then English)</w:t>
             </w:r>
           </w:p>
         </w:tc>
@@ -3539,7 +2708,7 @@
             <w:r>
               <w:rPr>
                 <w:b w:val="0"/>
-                <w:sz w:val="19"/>
+                <w:sz w:val="18"/>
               </w:rPr>
               <w:t>mp3/0001.mp3</w:t>
             </w:r>
@@ -3557,9 +2726,9 @@
             <w:r>
               <w:rPr>
                 <w:b w:val="0"/>
-                <w:sz w:val="19"/>
+                <w:sz w:val="18"/>
               </w:rPr>
-              <w:t>Kumusta! Ako si ALAGA, ang kasama mo sa kalusugan. Hello! I am ALAGA, your health buddy.</w:t>
+              <w:t>Magandang araw po! Ako si ALAGA. Good day! I am ALAGA.</w:t>
             </w:r>
           </w:p>
         </w:tc>
@@ -3577,7 +2746,7 @@
             <w:r>
               <w:rPr>
                 <w:b w:val="0"/>
-                <w:sz w:val="19"/>
+                <w:sz w:val="18"/>
               </w:rPr>
               <w:t>mp3/0002.mp3</w:t>
             </w:r>
@@ -3595,9 +2764,9 @@
             <w:r>
               <w:rPr>
                 <w:b w:val="0"/>
-                <w:sz w:val="19"/>
+                <w:sz w:val="18"/>
               </w:rPr>
-              <w:t>Gaano kasakit ang nararamdaman mo, mula 0 hanggang 10? Ipihit ang bilog, saka pindutin ang pulang button. How much pain do you feel, from 0 to 10? Turn the dial, then press the red button.</w:t>
+              <w:t>Gaano po kasakit ang nararamdaman ninyo, mula 0 hanggang 10? Ipihit ang bilog, saka pindutin ang pulang button. How much pain, 0 to 10? Turn the dial, then press the red button.</w:t>
             </w:r>
           </w:p>
         </w:tc>
@@ -3615,7 +2784,7 @@
             <w:r>
               <w:rPr>
                 <w:b w:val="0"/>
-                <w:sz w:val="19"/>
+                <w:sz w:val="18"/>
               </w:rPr>
               <w:t>mp3/0003.mp3</w:t>
             </w:r>
@@ -3633,9 +2802,9 @@
             <w:r>
               <w:rPr>
                 <w:b w:val="0"/>
-                <w:sz w:val="19"/>
+                <w:sz w:val="18"/>
               </w:rPr>
-              <w:t>Ilapit ang noo mo sa sensor sa itaas ng aking dibdib. Bring your forehead close to the sensor on my chest.</w:t>
+              <w:t>Ilapit po ang noo sa sensor sa aking dibdib. Bring your forehead close to the sensor on my chest.</w:t>
             </w:r>
           </w:p>
         </w:tc>
@@ -3653,7 +2822,7 @@
             <w:r>
               <w:rPr>
                 <w:b w:val="0"/>
-                <w:sz w:val="19"/>
+                <w:sz w:val="18"/>
               </w:rPr>
               <w:t>mp3/0004.mp3</w:t>
             </w:r>
@@ -3671,9 +2840,9 @@
             <w:r>
               <w:rPr>
                 <w:b w:val="0"/>
-                <w:sz w:val="19"/>
+                <w:sz w:val="18"/>
               </w:rPr>
-              <w:t>Ilagay ang hintuturo mo sa butas at huwag gumalaw. Place your index finger in the slot and keep still.</w:t>
+              <w:t>Ilagay po ang hintuturo sa butas at huwag gumalaw. Place your finger in the slot and keep still.</w:t>
             </w:r>
           </w:p>
         </w:tc>
@@ -3691,7 +2860,7 @@
             <w:r>
               <w:rPr>
                 <w:b w:val="0"/>
-                <w:sz w:val="19"/>
+                <w:sz w:val="18"/>
               </w:rPr>
               <w:t>mp3/0005.mp3</w:t>
             </w:r>
@@ -3709,9 +2878,9 @@
             <w:r>
               <w:rPr>
                 <w:b w:val="0"/>
-                <w:sz w:val="19"/>
+                <w:sz w:val="18"/>
               </w:rPr>
-              <w:t>Normal ang mga sukat mo. Uminom ng tubig at magpahinga. Your readings are normal. Drink water and rest.</w:t>
+              <w:t>Normal po ang inyong mga sukat. Your readings are normal.</w:t>
             </w:r>
           </w:p>
         </w:tc>
@@ -3729,7 +2898,7 @@
             <w:r>
               <w:rPr>
                 <w:b w:val="0"/>
-                <w:sz w:val="19"/>
+                <w:sz w:val="18"/>
               </w:rPr>
               <w:t>mp3/0006.mp3</w:t>
             </w:r>
@@ -3747,9 +2916,9 @@
             <w:r>
               <w:rPr>
                 <w:b w:val="0"/>
-                <w:sz w:val="19"/>
+                <w:sz w:val="18"/>
               </w:rPr>
-              <w:t>Pakipuntahan ang health worker para masuri ka pa. Please see the health worker for a check.</w:t>
+              <w:t>Sasabihan ko po ang pamilya ninyo. Magpahinga muna po kayo. I will tell your family. Please rest.</w:t>
             </w:r>
           </w:p>
         </w:tc>
@@ -3767,7 +2936,7 @@
             <w:r>
               <w:rPr>
                 <w:b w:val="0"/>
-                <w:sz w:val="19"/>
+                <w:sz w:val="18"/>
               </w:rPr>
               <w:t>mp3/0007.mp3</w:t>
             </w:r>
@@ -3785,9 +2954,9 @@
             <w:r>
               <w:rPr>
                 <w:b w:val="0"/>
-                <w:sz w:val="19"/>
+                <w:sz w:val="18"/>
               </w:rPr>
-              <w:t>Pumunta agad sa health worker ngayon din. Please see the health worker now.</w:t>
+              <w:t>Tinatawagan ko na po ang pamilya ninyo ngayon. I am alerting your family now.</w:t>
             </w:r>
           </w:p>
         </w:tc>
@@ -3805,7 +2974,7 @@
             <w:r>
               <w:rPr>
                 <w:b w:val="0"/>
-                <w:sz w:val="19"/>
+                <w:sz w:val="18"/>
               </w:rPr>
               <w:t>mp3/0008.mp3</w:t>
             </w:r>
@@ -3823,9 +2992,9 @@
             <w:r>
               <w:rPr>
                 <w:b w:val="0"/>
-                <w:sz w:val="19"/>
+                <w:sz w:val="18"/>
               </w:rPr>
-              <w:t>Salamat! Ingat palagi. Thank you! Take care.</w:t>
+              <w:t>Salamat po! Ingat palagi. Thank you! Take care.</w:t>
             </w:r>
           </w:p>
         </w:tc>
@@ -3843,7 +3012,7 @@
             <w:r>
               <w:rPr>
                 <w:b w:val="0"/>
-                <w:sz w:val="19"/>
+                <w:sz w:val="18"/>
               </w:rPr>
               <w:t>mp3/0009.mp3</w:t>
             </w:r>
@@ -3861,9 +3030,9 @@
             <w:r>
               <w:rPr>
                 <w:b w:val="0"/>
-                <w:sz w:val="19"/>
+                <w:sz w:val="18"/>
               </w:rPr>
-              <w:t>Mas lapit pa nang kaunti. A little closer, please.</w:t>
+              <w:t>Mas lapit pa po nang kaunti. A little closer, please.</w:t>
             </w:r>
           </w:p>
         </w:tc>
@@ -3881,7 +3050,7 @@
             <w:r>
               <w:rPr>
                 <w:b w:val="0"/>
-                <w:sz w:val="19"/>
+                <w:sz w:val="18"/>
               </w:rPr>
               <w:t>mp3/0010.mp3</w:t>
             </w:r>
@@ -3899,9 +3068,389 @@
             <w:r>
               <w:rPr>
                 <w:b w:val="0"/>
-                <w:sz w:val="19"/>
+                <w:sz w:val="18"/>
               </w:rPr>
-              <w:t>Hindi ko nabasa. Subukan ulit. I could not read that. Please try again.</w:t>
+              <w:t>Hindi ko po nabasa. Subukan ulit. I could not read that. Please try again.</w:t>
+            </w:r>
+          </w:p>
+        </w:tc>
+      </w:tr>
+      <w:tr>
+        <w:tc>
+          <w:tcPr>
+            <w:tcW w:type="dxa" w:w="1728"/>
+          </w:tcPr>
+          <w:p>
+            <w:pPr>
+              <w:spacing w:after="0" w:line="240" w:lineRule="auto"/>
+            </w:pPr>
+            <w:r/>
+            <w:r>
+              <w:rPr>
+                <w:b w:val="0"/>
+                <w:sz w:val="18"/>
+              </w:rPr>
+              <w:t>mp3/0011.mp3</w:t>
+            </w:r>
+          </w:p>
+        </w:tc>
+        <w:tc>
+          <w:tcPr>
+            <w:tcW w:type="dxa" w:w="7920"/>
+          </w:tcPr>
+          <w:p>
+            <w:pPr>
+              <w:spacing w:after="0" w:line="240" w:lineRule="auto"/>
+            </w:pPr>
+            <w:r/>
+            <w:r>
+              <w:rPr>
+                <w:b w:val="0"/>
+                <w:sz w:val="18"/>
+              </w:rPr>
+              <w:t>Oras na po ng inyong gamot. Pindutin ang pulang button pagkainom. It is time for your medicine. Press the red button after you take it.</w:t>
+            </w:r>
+          </w:p>
+        </w:tc>
+      </w:tr>
+      <w:tr>
+        <w:tc>
+          <w:tcPr>
+            <w:tcW w:type="dxa" w:w="1728"/>
+          </w:tcPr>
+          <w:p>
+            <w:pPr>
+              <w:spacing w:after="0" w:line="240" w:lineRule="auto"/>
+            </w:pPr>
+            <w:r/>
+            <w:r>
+              <w:rPr>
+                <w:b w:val="0"/>
+                <w:sz w:val="18"/>
+              </w:rPr>
+              <w:t>mp3/0012.mp3</w:t>
+            </w:r>
+          </w:p>
+        </w:tc>
+        <w:tc>
+          <w:tcPr>
+            <w:tcW w:type="dxa" w:w="7920"/>
+          </w:tcPr>
+          <w:p>
+            <w:pPr>
+              <w:spacing w:after="0" w:line="240" w:lineRule="auto"/>
+            </w:pPr>
+            <w:r/>
+            <w:r>
+              <w:rPr>
+                <w:b w:val="0"/>
+                <w:sz w:val="18"/>
+              </w:rPr>
+              <w:t>Paalala po ulit: oras na ng gamot. A reminder again: it is time for your medicine.</w:t>
+            </w:r>
+          </w:p>
+        </w:tc>
+      </w:tr>
+      <w:tr>
+        <w:tc>
+          <w:tcPr>
+            <w:tcW w:type="dxa" w:w="1728"/>
+          </w:tcPr>
+          <w:p>
+            <w:pPr>
+              <w:spacing w:after="0" w:line="240" w:lineRule="auto"/>
+            </w:pPr>
+            <w:r/>
+            <w:r>
+              <w:rPr>
+                <w:b w:val="0"/>
+                <w:sz w:val="18"/>
+              </w:rPr>
+              <w:t>mp3/0013.mp3</w:t>
+            </w:r>
+          </w:p>
+        </w:tc>
+        <w:tc>
+          <w:tcPr>
+            <w:tcW w:type="dxa" w:w="7920"/>
+          </w:tcPr>
+          <w:p>
+            <w:pPr>
+              <w:spacing w:after="0" w:line="240" w:lineRule="auto"/>
+            </w:pPr>
+            <w:r/>
+            <w:r>
+              <w:rPr>
+                <w:b w:val="0"/>
+                <w:sz w:val="18"/>
+              </w:rPr>
+              <w:t>Salamat po, naitala ko na. Thank you, I have recorded it.</w:t>
+            </w:r>
+          </w:p>
+        </w:tc>
+      </w:tr>
+      <w:tr>
+        <w:tc>
+          <w:tcPr>
+            <w:tcW w:type="dxa" w:w="1728"/>
+          </w:tcPr>
+          <w:p>
+            <w:pPr>
+              <w:spacing w:after="0" w:line="240" w:lineRule="auto"/>
+            </w:pPr>
+            <w:r/>
+            <w:r>
+              <w:rPr>
+                <w:b w:val="0"/>
+                <w:sz w:val="18"/>
+              </w:rPr>
+              <w:t>mp3/0014.mp3</w:t>
+            </w:r>
+          </w:p>
+        </w:tc>
+        <w:tc>
+          <w:tcPr>
+            <w:tcW w:type="dxa" w:w="7920"/>
+          </w:tcPr>
+          <w:p>
+            <w:pPr>
+              <w:spacing w:after="0" w:line="240" w:lineRule="auto"/>
+            </w:pPr>
+            <w:r/>
+            <w:r>
+              <w:rPr>
+                <w:b w:val="0"/>
+                <w:sz w:val="18"/>
+              </w:rPr>
+              <w:t>Kumusta po kayo? Pindutin ang pulang button kung okay lang kayo. How are you? Press the red button if you are okay.</w:t>
+            </w:r>
+          </w:p>
+        </w:tc>
+      </w:tr>
+      <w:tr>
+        <w:tc>
+          <w:tcPr>
+            <w:tcW w:type="dxa" w:w="1728"/>
+          </w:tcPr>
+          <w:p>
+            <w:pPr>
+              <w:spacing w:after="0" w:line="240" w:lineRule="auto"/>
+            </w:pPr>
+            <w:r/>
+            <w:r>
+              <w:rPr>
+                <w:b w:val="0"/>
+                <w:sz w:val="18"/>
+              </w:rPr>
+              <w:t>mp3/0015.mp3</w:t>
+            </w:r>
+          </w:p>
+        </w:tc>
+        <w:tc>
+          <w:tcPr>
+            <w:tcW w:type="dxa" w:w="7920"/>
+          </w:tcPr>
+          <w:p>
+            <w:pPr>
+              <w:spacing w:after="0" w:line="240" w:lineRule="auto"/>
+            </w:pPr>
+            <w:r/>
+            <w:r>
+              <w:rPr>
+                <w:b w:val="0"/>
+                <w:sz w:val="18"/>
+              </w:rPr>
+              <w:t>Uminom po tayo ng tubig. Let us drink some water.</w:t>
+            </w:r>
+          </w:p>
+        </w:tc>
+      </w:tr>
+      <w:tr>
+        <w:tc>
+          <w:tcPr>
+            <w:tcW w:type="dxa" w:w="1728"/>
+          </w:tcPr>
+          <w:p>
+            <w:pPr>
+              <w:spacing w:after="0" w:line="240" w:lineRule="auto"/>
+            </w:pPr>
+            <w:r/>
+            <w:r>
+              <w:rPr>
+                <w:b w:val="0"/>
+                <w:sz w:val="18"/>
+              </w:rPr>
+              <w:t>mp3/0016.mp3</w:t>
+            </w:r>
+          </w:p>
+        </w:tc>
+        <w:tc>
+          <w:tcPr>
+            <w:tcW w:type="dxa" w:w="7920"/>
+          </w:tcPr>
+          <w:p>
+            <w:pPr>
+              <w:spacing w:after="0" w:line="240" w:lineRule="auto"/>
+            </w:pPr>
+            <w:r/>
+            <w:r>
+              <w:rPr>
+                <w:b w:val="0"/>
+                <w:sz w:val="18"/>
+              </w:rPr>
+              <w:t>Paumanhin po, dadaan ako. Excuse me, I am passing through.</w:t>
+            </w:r>
+          </w:p>
+        </w:tc>
+      </w:tr>
+      <w:tr>
+        <w:tc>
+          <w:tcPr>
+            <w:tcW w:type="dxa" w:w="1728"/>
+          </w:tcPr>
+          <w:p>
+            <w:pPr>
+              <w:spacing w:after="0" w:line="240" w:lineRule="auto"/>
+            </w:pPr>
+            <w:r/>
+            <w:r>
+              <w:rPr>
+                <w:b w:val="0"/>
+                <w:sz w:val="18"/>
+              </w:rPr>
+              <w:t>mp3/0017.mp3</w:t>
+            </w:r>
+          </w:p>
+        </w:tc>
+        <w:tc>
+          <w:tcPr>
+            <w:tcW w:type="dxa" w:w="7920"/>
+          </w:tcPr>
+          <w:p>
+            <w:pPr>
+              <w:spacing w:after="0" w:line="240" w:lineRule="auto"/>
+            </w:pPr>
+            <w:r/>
+            <w:r>
+              <w:rPr>
+                <w:b w:val="0"/>
+                <w:sz w:val="18"/>
+              </w:rPr>
+              <w:t>Narinig ko po kayo. Ipinapaalam ko na sa pamilya ninyo. I heard you. I am alerting your family.</w:t>
+            </w:r>
+          </w:p>
+        </w:tc>
+      </w:tr>
+      <w:tr>
+        <w:tc>
+          <w:tcPr>
+            <w:tcW w:type="dxa" w:w="1728"/>
+          </w:tcPr>
+          <w:p>
+            <w:pPr>
+              <w:spacing w:after="0" w:line="240" w:lineRule="auto"/>
+            </w:pPr>
+            <w:r/>
+            <w:r>
+              <w:rPr>
+                <w:b w:val="0"/>
+                <w:sz w:val="18"/>
+              </w:rPr>
+              <w:t>mp3/0018.mp3</w:t>
+            </w:r>
+          </w:p>
+        </w:tc>
+        <w:tc>
+          <w:tcPr>
+            <w:tcW w:type="dxa" w:w="7920"/>
+          </w:tcPr>
+          <w:p>
+            <w:pPr>
+              <w:spacing w:after="0" w:line="240" w:lineRule="auto"/>
+            </w:pPr>
+            <w:r/>
+            <w:r>
+              <w:rPr>
+                <w:b w:val="0"/>
+                <w:sz w:val="18"/>
+              </w:rPr>
+              <w:t>Tinawag niyo po ako? Pindutin ang button kung okay kayo. Did you call me? Press the button if you are okay.</w:t>
+            </w:r>
+          </w:p>
+        </w:tc>
+      </w:tr>
+      <w:tr>
+        <w:tc>
+          <w:tcPr>
+            <w:tcW w:type="dxa" w:w="1728"/>
+          </w:tcPr>
+          <w:p>
+            <w:pPr>
+              <w:spacing w:after="0" w:line="240" w:lineRule="auto"/>
+            </w:pPr>
+            <w:r/>
+            <w:r>
+              <w:rPr>
+                <w:b w:val="0"/>
+                <w:sz w:val="18"/>
+              </w:rPr>
+              <w:t>mp3/0019.mp3</w:t>
+            </w:r>
+          </w:p>
+        </w:tc>
+        <w:tc>
+          <w:tcPr>
+            <w:tcW w:type="dxa" w:w="7920"/>
+          </w:tcPr>
+          <w:p>
+            <w:pPr>
+              <w:spacing w:after="0" w:line="240" w:lineRule="auto"/>
+            </w:pPr>
+            <w:r/>
+            <w:r>
+              <w:rPr>
+                <w:b w:val="0"/>
+                <w:sz w:val="18"/>
+              </w:rPr>
+              <w:t>Ipihit ang bilog para pumili ng kanta o dasal, saka pindutin ang button. Turn the dial to choose a song or prayer, then press the button.</w:t>
+            </w:r>
+          </w:p>
+        </w:tc>
+      </w:tr>
+      <w:tr>
+        <w:tc>
+          <w:tcPr>
+            <w:tcW w:type="dxa" w:w="1728"/>
+          </w:tcPr>
+          <w:p>
+            <w:pPr>
+              <w:spacing w:after="0" w:line="240" w:lineRule="auto"/>
+            </w:pPr>
+            <w:r/>
+            <w:r>
+              <w:rPr>
+                <w:b w:val="0"/>
+                <w:sz w:val="18"/>
+              </w:rPr>
+              <w:t>mp3/0020.mp3</w:t>
+            </w:r>
+          </w:p>
+        </w:tc>
+        <w:tc>
+          <w:tcPr>
+            <w:tcW w:type="dxa" w:w="7920"/>
+          </w:tcPr>
+          <w:p>
+            <w:pPr>
+              <w:spacing w:after="0" w:line="240" w:lineRule="auto"/>
+            </w:pPr>
+            <w:r/>
+            <w:r>
+              <w:rPr>
+                <w:b w:val="0"/>
+                <w:sz w:val="18"/>
+              </w:rPr>
+              <w:t>Babalik na po ako sa aking puwesto. I am going back to my place.</w:t>
             </w:r>
           </w:p>
         </w:tc>
@@ -3925,7 +3474,61 @@
           <w:color w:val="1F2A44"/>
           <w:sz w:val="30"/>
         </w:rPr>
-        <w:t>6. First Power-Up Checklist</w:t>
+        <w:t>6. Tape the Home Route and Do the First Run</w:t>
+      </w:r>
+    </w:p>
+    <w:p>
+      <w:pPr>
+        <w:keepNext/>
+        <w:jc w:val="center"/>
+      </w:pPr>
+      <w:r>
+        <w:drawing>
+          <wp:inline xmlns:a="http://schemas.openxmlformats.org/drawingml/2006/main" xmlns:pic="http://schemas.openxmlformats.org/drawingml/2006/picture">
+            <wp:extent cx="4206240" cy="2760345"/>
+            <wp:docPr id="4" name="Picture 4"/>
+            <wp:cNvGraphicFramePr>
+              <a:graphicFrameLocks noChangeAspect="1"/>
+            </wp:cNvGraphicFramePr>
+            <a:graphic>
+              <a:graphicData uri="http://schemas.openxmlformats.org/drawingml/2006/picture">
+                <pic:pic>
+                  <pic:nvPicPr>
+                    <pic:cNvPr id="0" name="fig5_route.png"/>
+                    <pic:cNvPicPr/>
+                  </pic:nvPicPr>
+                  <pic:blipFill>
+                    <a:blip r:embed="rId12"/>
+                    <a:stretch>
+                      <a:fillRect/>
+                    </a:stretch>
+                  </pic:blipFill>
+                  <pic:spPr>
+                    <a:xfrm>
+                      <a:off x="0" y="0"/>
+                      <a:ext cx="4206240" cy="2760345"/>
+                    </a:xfrm>
+                    <a:prstGeom prst="rect"/>
+                  </pic:spPr>
+                </pic:pic>
+              </a:graphicData>
+            </a:graphic>
+          </wp:inline>
+        </w:drawing>
+      </w:r>
+    </w:p>
+    <w:p>
+      <w:pPr>
+        <w:spacing w:after="160"/>
+        <w:jc w:val="center"/>
+      </w:pPr>
+      <w:r>
+        <w:rPr>
+          <w:b w:val="0"/>
+          <w:i/>
+          <w:sz w:val="20"/>
+        </w:rPr>
+        <w:t>Figure C. Example route: one loop through the dock, chair, bed, and kitchen.</w:t>
       </w:r>
     </w:p>
     <w:p>
@@ -3943,7 +3546,7 @@
         </w:rPr>
         <w:t>1.</w:t>
         <w:tab/>
-        <w:t>Put ALAGA on the 45-cm stool so the chest box is about 1.0–1.1 m from the floor (forehead height of a seated adult; children can stand).</w:t>
+        <w:t>Plan one closed loop at least 50 cm from walls and furniture legs, with gentle corners (radius 30 cm or more). Lay 19-mm black electrical tape on a clean, light floor; press it flat so no one trips.</w:t>
       </w:r>
     </w:p>
     <w:p>
@@ -3961,7 +3564,7 @@
         </w:rPr>
         <w:t>2.</w:t>
         <w:tab/>
-        <w:t>Switch on. The OLED shows “ALAGA / Press my chest” and the fan is off.</w:t>
+        <w:t>Mark each station with a 15-cm strip across the line, in this order around the loop: dock (0), chair (1), bed (2), kitchen (3). ALAGA always drives the same way around the loop.</w:t>
       </w:r>
     </w:p>
     <w:p>
@@ -3979,7 +3582,7 @@
         </w:rPr>
         <w:t>3.</w:t>
         <w:tab/>
-        <w:t>Press the chest button. The fan starts and the body fills in about 20 seconds. If it fills too slowly, seal seams; if it is too hard, leave a 2-cm gap open in a bottom seam.</w:t>
+        <w:t>Put ALAGA on the line just past the dock marker, facing the chair. Switch on. Hold the red button for 5 s to tell it that it is at the dock.</w:t>
       </w:r>
     </w:p>
     <w:p>
@@ -3997,7 +3600,7 @@
         </w:rPr>
         <w:t>4.</w:t>
         <w:tab/>
-        <w:t>ALAGA greets you and asks for pain. Turn the dial; the OLED shows the number. Press the button.</w:t>
+        <w:t>Send /check in the Telegram group. ALAGA inflates (30 s), drives to the chair, asks “Kumusta po kayo?”, and waits for the button. Press it; the group gets the answer, and ALAGA goes around the loop to the dock and deflates.</w:t>
       </w:r>
     </w:p>
     <w:p>
@@ -4015,7 +3618,7 @@
         </w:rPr>
         <w:t>5.</w:t>
         <w:tab/>
-        <w:t>Bring your forehead 3–5 cm from the sensor. ALAGA reads it and asks for your finger.</w:t>
+        <w:t>Put a box on the line: ALAGA must stop about 25 cm before it and say “Excuse me”. Push the bumper: it must stop and back up a little.</w:t>
       </w:r>
     </w:p>
     <w:p>
@@ -4033,7 +3636,7 @@
         </w:rPr>
         <w:t>6.</w:t>
         <w:tab/>
-        <w:t>Put your finger in the slot and keep still for about 5 seconds. ALAGA speaks GREEN, YELLOW, or RED and shows the readings.</w:t>
+        <w:t>Send /vitals and do a full health check; then /status to see the last results.</w:t>
       </w:r>
     </w:p>
     <w:p>
@@ -4051,7 +3654,7 @@
         </w:rPr>
         <w:t>7.</w:t>
         <w:tab/>
-        <w:t>Walk away. After 30 seconds the fan stops and the body goes flat.</w:t>
+        <w:t>Wear the pendant and drop onto a gym mat (researchers only). After the 10-s beep, the group must get a FALL alert. Repeat and press the pendant button during the beep: no alert should be sent.</w:t>
       </w:r>
     </w:p>
     <w:p>
@@ -4069,7 +3672,7 @@
         </w:rPr>
         <w:t>8.</w:t>
         <w:tab/>
-        <w:t>Check the log: each screening is saved in the ESP32's memory (/log.csv) and printed on the Serial Monitor as RESULT,… lines. Copy these lines into Excel.</w:t>
+        <w:t>Charge the robot battery every night and the pendant every 2–3 days.</w:t>
       </w:r>
     </w:p>
     <w:p>
@@ -4085,19 +3688,7 @@
           <w:color w:val="1F2A44"/>
           <w:sz w:val="30"/>
         </w:rPr>
-        <w:t>7. Calibrate</w:t>
-      </w:r>
-    </w:p>
-    <w:p>
-      <w:pPr>
-        <w:spacing w:after="80"/>
-      </w:pPr>
-      <w:r>
-        <w:rPr>
-          <w:b w:val="0"/>
-          <w:i w:val="0"/>
-        </w:rPr>
-        <w:t>The MLX90614 reads forehead skin, which is cooler than the body, and low-cost oximeter readings drift. Calibrate before the real tests (only after IRB approval).</w:t>
+        <w:t>7. Calibrate and Test</w:t>
       </w:r>
     </w:p>
     <w:p>
@@ -4115,7 +3706,7 @@
         </w:rPr>
         <w:t>1.</w:t>
         <w:tab/>
-        <w:t>Bench test: fill a pot with water, put a black-painted can in it, and heat it slowly. With the probe thermometer in the water, take 10 ALAGA readings at 35.0, 36.0, 37.0, 37.5, 38.0, and 40.0 °C. This checks that the sensor is steady and linear.</w:t>
+        <w:t>Bench test: heat water with a black-painted can and a probe thermometer; take 10 ALAGA readings at 35.0, 36.0, 37.0, 37.5, 38.0, and 40.0 °C.</w:t>
       </w:r>
     </w:p>
     <w:p>
@@ -4133,7 +3724,7 @@
         </w:rPr>
         <w:t>2.</w:t>
         <w:tab/>
-        <w:t>Calibration volunteers (10 people): take three ALAGA readings and three reference readings (clinic thermometer and pulse oximeter) for each person, within 1 minute of each other.</w:t>
+        <w:t>Calibration set (10 volunteers, after IRB approval): three ALAGA and three reference readings each. In Excel, =SLOPE(reference, raw) gives TEMP_A and =INTERCEPT(reference, raw) gives TEMP_B (set TEMP_A = 1 and TEMP_B = 0 while collecting raw readings). Average (reference − ALAGA) for PR_OFFSET and SPO2_OFFSET.</w:t>
       </w:r>
     </w:p>
     <w:p>
@@ -4151,7 +3742,7 @@
         </w:rPr>
         <w:t>3.</w:t>
         <w:tab/>
-        <w:t>Temperature: in Excel, put the raw MLX90614 readings in column A and the reference in column B. =SLOPE(B:B,A:A) gives TEMP_A, and =INTERCEPT(B:B,A:A) gives TEMP_B. To get the raw readings, set TEMP_A = 1 and TEMP_B = 0 in the code during this step.</w:t>
+        <w:t>Fall thresholds: with the first 10 simulated falls and 10 daily activities (sit, lie on a bed, bend, walk, climb a step), check the peak and low g values in the pendant's Serial Monitor and adjust FREE_FALL_G and IMPACT_G if needed. Then keep them fixed for the real tests.</w:t>
       </w:r>
     </w:p>
     <w:p>
@@ -4169,52 +3760,7 @@
         </w:rPr>
         <w:t>4.</w:t>
         <w:tab/>
-        <w:t>Pulse and SpO₂: average (reference − ALAGA) for each; round to a whole number for PR_OFFSET and SPO2_OFFSET.</w:t>
-      </w:r>
-    </w:p>
-    <w:p>
-      <w:pPr>
-        <w:tabs>
-          <w:tab w:pos="504" w:val="left"/>
-        </w:tabs>
-        <w:spacing w:after="80"/>
-        <w:ind w:left="504" w:hanging="504"/>
-      </w:pPr>
-      <w:r>
-        <w:rPr>
-          <w:b w:val="0"/>
-          <w:i w:val="0"/>
-        </w:rPr>
-        <w:t>5.</w:t>
-        <w:tab/>
-        <w:t>Type the four values into the top of alaga.ino and upload again. Do not use these 10 volunteers in the validation tests.</w:t>
-      </w:r>
-    </w:p>
-    <w:p>
-      <w:pPr>
-        <w:keepNext/>
-        <w:spacing w:after="60" w:before="160"/>
-      </w:pPr>
-      <w:r>
-        <w:rPr>
-          <w:b/>
-          <w:i w:val="0"/>
-          <w:color w:val="1F2A44"/>
-          <w:sz w:val="25"/>
-        </w:rPr>
-        <w:t>Rigid shell for the usability test</w:t>
-      </w:r>
-    </w:p>
-    <w:p>
-      <w:pPr>
-        <w:spacing w:after="80"/>
-      </w:pPr>
-      <w:r>
-        <w:rPr>
-          <w:b w:val="0"/>
-          <w:i w:val="0"/>
-        </w:rPr>
-        <w:t>Roll a coroplast sheet into a cylinder about 60 cm wide and 75 cm tall, add a 30-cm coroplast dome for the head, and draw the same two-dot face. Cut a window so the same chest box shows through. Volunteers use ALAGA once with the soft body and once inside the rigid shell (in alternating order) and rate how approachable each felt from 1 to 5.</w:t>
+        <w:t>Run the trials in the paper (Table 7): navigation trips, validation health checks, falls and activities, 5 days of reminders, and the soft-versus-rigid usability test (rigid shell: a coroplast cylinder with the same chest box and face).</w:t>
       </w:r>
     </w:p>
     <w:p>
@@ -4242,14 +3788,14 @@
         <w:tblLook w:firstColumn="1" w:firstRow="1" w:lastColumn="0" w:lastRow="0" w:noHBand="0" w:noVBand="1" w:val="04A0"/>
       </w:tblPr>
       <w:tblGrid>
-        <w:gridCol w:w="2592"/>
+        <w:gridCol w:w="2736"/>
         <w:gridCol w:w="3312"/>
-        <w:gridCol w:w="3744"/>
+        <w:gridCol w:w="3600"/>
       </w:tblGrid>
       <w:tr>
         <w:tc>
           <w:tcPr>
-            <w:tcW w:type="dxa" w:w="2592"/>
+            <w:tcW w:type="dxa" w:w="2736"/>
             <w:shd w:val="clear" w:fill="1F2A44"/>
           </w:tcPr>
           <w:p>
@@ -4289,7 +3835,7 @@
         </w:tc>
         <w:tc>
           <w:tcPr>
-            <w:tcW w:type="dxa" w:w="3744"/>
+            <w:tcW w:type="dxa" w:w="3600"/>
             <w:shd w:val="clear" w:fill="1F2A44"/>
           </w:tcPr>
           <w:p>
@@ -4311,7 +3857,7 @@
       <w:tr>
         <w:tc>
           <w:tcPr>
-            <w:tcW w:type="dxa" w:w="2592"/>
+            <w:tcW w:type="dxa" w:w="2736"/>
           </w:tcPr>
           <w:p>
             <w:pPr>
@@ -4347,7 +3893,7 @@
         </w:tc>
         <w:tc>
           <w:tcPr>
-            <w:tcW w:type="dxa" w:w="3744"/>
+            <w:tcW w:type="dxa" w:w="3600"/>
           </w:tcPr>
           <w:p>
             <w:pPr>
@@ -4359,7 +3905,7 @@
                 <w:b w:val="0"/>
                 <w:sz w:val="19"/>
               </w:rPr>
-              <w:t>Check fuse with multimeter; charge battery</w:t>
+              <w:t>Check fuse; charge battery</w:t>
             </w:r>
           </w:p>
         </w:tc>
@@ -4367,7 +3913,7 @@
       <w:tr>
         <w:tc>
           <w:tcPr>
-            <w:tcW w:type="dxa" w:w="2592"/>
+            <w:tcW w:type="dxa" w:w="2736"/>
           </w:tcPr>
           <w:p>
             <w:pPr>
@@ -4379,7 +3925,7 @@
                 <w:b w:val="0"/>
                 <w:sz w:val="19"/>
               </w:rPr>
-              <w:t>ESP32 gets hot or dies</w:t>
+              <w:t>Robot spins or leaves the line</w:t>
             </w:r>
           </w:p>
         </w:tc>
@@ -4397,13 +3943,13 @@
                 <w:b w:val="0"/>
                 <w:sz w:val="19"/>
               </w:rPr>
-              <w:t>LM2596 not set to 5 V</w:t>
+              <w:t>Motor wires swapped; speed too high</w:t>
             </w:r>
           </w:p>
         </w:tc>
         <w:tc>
           <w:tcPr>
-            <w:tcW w:type="dxa" w:w="3744"/>
+            <w:tcW w:type="dxa" w:w="3600"/>
           </w:tcPr>
           <w:p>
             <w:pPr>
@@ -4415,7 +3961,7 @@
                 <w:b w:val="0"/>
                 <w:sz w:val="19"/>
               </w:rPr>
-              <w:t>Re-set output to 5.0 V before connecting</w:t>
+              <w:t>Swap wires; lower SPEED or KP</w:t>
             </w:r>
           </w:p>
         </w:tc>
@@ -4423,7 +3969,7 @@
       <w:tr>
         <w:tc>
           <w:tcPr>
-            <w:tcW w:type="dxa" w:w="2592"/>
+            <w:tcW w:type="dxa" w:w="2736"/>
           </w:tcPr>
           <w:p>
             <w:pPr>
@@ -4435,7 +3981,7 @@
                 <w:b w:val="0"/>
                 <w:sz w:val="19"/>
               </w:rPr>
-              <w:t>Fan never starts</w:t>
+              <w:t>Stops at the wrong station</w:t>
             </w:r>
           </w:p>
         </w:tc>
@@ -4453,13 +3999,13 @@
                 <w:b w:val="0"/>
                 <w:sz w:val="19"/>
               </w:rPr>
-              <w:t>D4184 GND not common; wrong pin</w:t>
+              <w:t>A marker was missed or doubled</w:t>
             </w:r>
           </w:p>
         </w:tc>
         <w:tc>
           <w:tcPr>
-            <w:tcW w:type="dxa" w:w="3744"/>
+            <w:tcW w:type="dxa" w:w="3600"/>
           </w:tcPr>
           <w:p>
             <w:pPr>
@@ -4471,7 +4017,7 @@
                 <w:b w:val="0"/>
                 <w:sz w:val="19"/>
               </w:rPr>
-              <w:t>Join all GNDs; check GPIO 25 wire</w:t>
+              <w:t>Make markers 15 cm; fix tape gaps</w:t>
             </w:r>
           </w:p>
         </w:tc>
@@ -4479,7 +4025,7 @@
       <w:tr>
         <w:tc>
           <w:tcPr>
-            <w:tcW w:type="dxa" w:w="2592"/>
+            <w:tcW w:type="dxa" w:w="2736"/>
           </w:tcPr>
           <w:p>
             <w:pPr>
@@ -4491,7 +4037,7 @@
                 <w:b w:val="0"/>
                 <w:sz w:val="19"/>
               </w:rPr>
-              <w:t>No sound</w:t>
+              <w:t>No Telegram messages</w:t>
             </w:r>
           </w:p>
         </w:tc>
@@ -4509,13 +4055,13 @@
                 <w:b w:val="0"/>
                 <w:sz w:val="19"/>
               </w:rPr>
-              <w:t>Wrong folder or file names; volume</w:t>
+              <w:t>Wrong token or chat id; Wi-Fi down</w:t>
             </w:r>
           </w:p>
         </w:tc>
         <w:tc>
           <w:tcPr>
-            <w:tcW w:type="dxa" w:w="3744"/>
+            <w:tcW w:type="dxa" w:w="3600"/>
           </w:tcPr>
           <w:p>
             <w:pPr>
@@ -4527,7 +4073,7 @@
                 <w:b w:val="0"/>
                 <w:sz w:val="19"/>
               </w:rPr>
-              <w:t>Folder must be mp3, names 0001.mp3 …</w:t>
+              <w:t>Check settings; Serial Monitor shows SENT</w:t>
             </w:r>
           </w:p>
         </w:tc>
@@ -4535,7 +4081,119 @@
       <w:tr>
         <w:tc>
           <w:tcPr>
-            <w:tcW w:type="dxa" w:w="2592"/>
+            <w:tcW w:type="dxa" w:w="2736"/>
+          </w:tcPr>
+          <w:p>
+            <w:pPr>
+              <w:spacing w:after="0" w:line="240" w:lineRule="auto"/>
+            </w:pPr>
+            <w:r/>
+            <w:r>
+              <w:rPr>
+                <w:b w:val="0"/>
+                <w:sz w:val="19"/>
+              </w:rPr>
+              <w:t>Pendant alerts not received</w:t>
+            </w:r>
+          </w:p>
+        </w:tc>
+        <w:tc>
+          <w:tcPr>
+            <w:tcW w:type="dxa" w:w="3312"/>
+          </w:tcPr>
+          <w:p>
+            <w:pPr>
+              <w:spacing w:after="0" w:line="240" w:lineRule="auto"/>
+            </w:pPr>
+            <w:r/>
+            <w:r>
+              <w:rPr>
+                <w:b w:val="0"/>
+                <w:sz w:val="19"/>
+              </w:rPr>
+              <w:t>Wrong Wi-Fi channel in the pendant</w:t>
+            </w:r>
+          </w:p>
+        </w:tc>
+        <w:tc>
+          <w:tcPr>
+            <w:tcW w:type="dxa" w:w="3600"/>
+          </w:tcPr>
+          <w:p>
+            <w:pPr>
+              <w:spacing w:after="0" w:line="240" w:lineRule="auto"/>
+            </w:pPr>
+            <w:r/>
+            <w:r>
+              <w:rPr>
+                <w:b w:val="0"/>
+                <w:sz w:val="19"/>
+              </w:rPr>
+              <w:t>Use the channel the robot prints</w:t>
+            </w:r>
+          </w:p>
+        </w:tc>
+      </w:tr>
+      <w:tr>
+        <w:tc>
+          <w:tcPr>
+            <w:tcW w:type="dxa" w:w="2736"/>
+          </w:tcPr>
+          <w:p>
+            <w:pPr>
+              <w:spacing w:after="0" w:line="240" w:lineRule="auto"/>
+            </w:pPr>
+            <w:r/>
+            <w:r>
+              <w:rPr>
+                <w:b w:val="0"/>
+                <w:sz w:val="19"/>
+              </w:rPr>
+              <w:t>Too many false falls</w:t>
+            </w:r>
+          </w:p>
+        </w:tc>
+        <w:tc>
+          <w:tcPr>
+            <w:tcW w:type="dxa" w:w="3312"/>
+          </w:tcPr>
+          <w:p>
+            <w:pPr>
+              <w:spacing w:after="0" w:line="240" w:lineRule="auto"/>
+            </w:pPr>
+            <w:r/>
+            <w:r>
+              <w:rPr>
+                <w:b w:val="0"/>
+                <w:sz w:val="19"/>
+              </w:rPr>
+              <w:t>Thresholds too low</w:t>
+            </w:r>
+          </w:p>
+        </w:tc>
+        <w:tc>
+          <w:tcPr>
+            <w:tcW w:type="dxa" w:w="3600"/>
+          </w:tcPr>
+          <w:p>
+            <w:pPr>
+              <w:spacing w:after="0" w:line="240" w:lineRule="auto"/>
+            </w:pPr>
+            <w:r/>
+            <w:r>
+              <w:rPr>
+                <w:b w:val="0"/>
+                <w:sz w:val="19"/>
+              </w:rPr>
+              <w:t>Raise IMPACT_G a little; re-test</w:t>
+            </w:r>
+          </w:p>
+        </w:tc>
+      </w:tr>
+      <w:tr>
+        <w:tc>
+          <w:tcPr>
+            <w:tcW w:type="dxa" w:w="2736"/>
           </w:tcPr>
           <w:p>
             <w:pPr>
@@ -4565,13 +4223,13 @@
                 <w:b w:val="0"/>
                 <w:sz w:val="19"/>
               </w:rPr>
-              <w:t>Too far, sweat, or not calibrated</w:t>
+              <w:t>Too far, sweat, not calibrated</w:t>
             </w:r>
           </w:p>
         </w:tc>
         <w:tc>
           <w:tcPr>
-            <w:tcW w:type="dxa" w:w="3744"/>
+            <w:tcW w:type="dxa" w:w="3600"/>
           </w:tcPr>
           <w:p>
             <w:pPr>
@@ -4583,7 +4241,7 @@
                 <w:b w:val="0"/>
                 <w:sz w:val="19"/>
               </w:rPr>
-              <w:t>Keep 3–5 cm; wipe forehead; calibrate</w:t>
+              <w:t>3–5 cm; wipe forehead; calibrate</w:t>
             </w:r>
           </w:p>
         </w:tc>
@@ -4591,63 +4249,7 @@
       <w:tr>
         <w:tc>
           <w:tcPr>
-            <w:tcW w:type="dxa" w:w="2592"/>
-          </w:tcPr>
-          <w:p>
-            <w:pPr>
-              <w:spacing w:after="0" w:line="240" w:lineRule="auto"/>
-            </w:pPr>
-            <w:r/>
-            <w:r>
-              <w:rPr>
-                <w:b w:val="0"/>
-                <w:sz w:val="19"/>
-              </w:rPr>
-              <w:t>“Try again” keeps playing</w:t>
-            </w:r>
-          </w:p>
-        </w:tc>
-        <w:tc>
-          <w:tcPr>
-            <w:tcW w:type="dxa" w:w="3312"/>
-          </w:tcPr>
-          <w:p>
-            <w:pPr>
-              <w:spacing w:after="0" w:line="240" w:lineRule="auto"/>
-            </w:pPr>
-            <w:r/>
-            <w:r>
-              <w:rPr>
-                <w:b w:val="0"/>
-                <w:sz w:val="19"/>
-              </w:rPr>
-              <w:t>Finger moving, cold, or nail polish</w:t>
-            </w:r>
-          </w:p>
-        </w:tc>
-        <w:tc>
-          <w:tcPr>
-            <w:tcW w:type="dxa" w:w="3744"/>
-          </w:tcPr>
-          <w:p>
-            <w:pPr>
-              <w:spacing w:after="0" w:line="240" w:lineRule="auto"/>
-            </w:pPr>
-            <w:r/>
-            <w:r>
-              <w:rPr>
-                <w:b w:val="0"/>
-                <w:sz w:val="19"/>
-              </w:rPr>
-              <w:t>Warm hand, keep still, remove polish</w:t>
-            </w:r>
-          </w:p>
-        </w:tc>
-      </w:tr>
-      <w:tr>
-        <w:tc>
-          <w:tcPr>
-            <w:tcW w:type="dxa" w:w="2592"/>
+            <w:tcW w:type="dxa" w:w="2736"/>
           </w:tcPr>
           <w:p>
             <w:pPr>
@@ -4683,7 +4285,7 @@
         </w:tc>
         <w:tc>
           <w:tcPr>
-            <w:tcW w:type="dxa" w:w="3744"/>
+            <w:tcW w:type="dxa" w:w="3600"/>
           </w:tcPr>
           <w:p>
             <w:pPr>
@@ -4696,62 +4298,6 @@
                 <w:sz w:val="19"/>
               </w:rPr>
               <w:t>Seal seam; re-staple the hem</w:t>
-            </w:r>
-          </w:p>
-        </w:tc>
-      </w:tr>
-      <w:tr>
-        <w:tc>
-          <w:tcPr>
-            <w:tcW w:type="dxa" w:w="2592"/>
-          </w:tcPr>
-          <w:p>
-            <w:pPr>
-              <w:spacing w:after="0" w:line="240" w:lineRule="auto"/>
-            </w:pPr>
-            <w:r/>
-            <w:r>
-              <w:rPr>
-                <w:b w:val="0"/>
-                <w:sz w:val="19"/>
-              </w:rPr>
-              <w:t>OLED blank</w:t>
-            </w:r>
-          </w:p>
-        </w:tc>
-        <w:tc>
-          <w:tcPr>
-            <w:tcW w:type="dxa" w:w="3312"/>
-          </w:tcPr>
-          <w:p>
-            <w:pPr>
-              <w:spacing w:after="0" w:line="240" w:lineRule="auto"/>
-            </w:pPr>
-            <w:r/>
-            <w:r>
-              <w:rPr>
-                <w:b w:val="0"/>
-                <w:sz w:val="19"/>
-              </w:rPr>
-              <w:t>Wrong address or loose SDA/SCL</w:t>
-            </w:r>
-          </w:p>
-        </w:tc>
-        <w:tc>
-          <w:tcPr>
-            <w:tcW w:type="dxa" w:w="3744"/>
-          </w:tcPr>
-          <w:p>
-            <w:pPr>
-              <w:spacing w:after="0" w:line="240" w:lineRule="auto"/>
-            </w:pPr>
-            <w:r/>
-            <w:r>
-              <w:rPr>
-                <w:b w:val="0"/>
-                <w:sz w:val="19"/>
-              </w:rPr>
-              <w:t>Run the I²C scanner; recheck wires</w:t>
             </w:r>
           </w:p>
         </w:tc>
@@ -4777,7 +4323,7 @@
         </w:rPr>
         <w:t>•</w:t>
         <w:tab/>
-        <w:t>Wipe the forehead sensor window and the finger slot with 70% alcohol after every person.</w:t>
+        <w:t>Wipe the forehead window and finger slot with 70% alcohol after each use.</w:t>
       </w:r>
     </w:p>
     <w:p>
@@ -4795,7 +4341,7 @@
         </w:rPr>
         <w:t>•</w:t>
         <w:tab/>
-        <w:t>Charge the battery every night; never leave it fully empty.</w:t>
+        <w:t>Keep the tape route clean and flat; replace torn tape.</w:t>
       </w:r>
     </w:p>
     <w:p>
@@ -4813,25 +4359,7 @@
         </w:rPr>
         <w:t>•</w:t>
         <w:tab/>
-        <w:t>Fold the body loosely when stored; keep it away from sharp objects and direct sunlight.</w:t>
-      </w:r>
-    </w:p>
-    <w:p>
-      <w:pPr>
-        <w:tabs>
-          <w:tab w:pos="432" w:val="left"/>
-        </w:tabs>
-        <w:spacing w:after="80"/>
-        <w:ind w:left="432" w:hanging="288"/>
-      </w:pPr>
-      <w:r>
-        <w:rPr>
-          <w:b w:val="0"/>
-          <w:i w:val="0"/>
-        </w:rPr>
-        <w:t>•</w:t>
-        <w:tab/>
-        <w:t>The robot's results guide people to a health worker; they never replace one.</w:t>
+        <w:t>ALAGA helps the family watch over Lola or Lolo; it never replaces a visit, a call, or a doctor.</w:t>
       </w:r>
     </w:p>
     <w:sectPr>

</xml_diff>